<commit_message>
feat: 8+8 exhibits, 12-wk/2-ch curriculum + toolchain pricing, fix broken photo ref, ai-lab-final → Proposal Package primary CTA
</commit_message>
<xml_diff>
--- a/ai-lab-idc/Oakwood_AI_Lab_IDC_Proposal.docx
+++ b/ai-lab-idc/Oakwood_AI_Lab_IDC_Proposal.docx
@@ -278,7 +278,7 @@
         <w:t xml:space="preserve"> </w:t>
       </w:r>
       <w:r>
-        <w:t xml:space="preserve">initiates procurement &amp; sub scheduling (see Payment Schedule, p.11).</w:t>
+        <w:t xml:space="preserve">initiates procurement &amp; sub scheduling (see Payment Schedule, p.8).</w:t>
       </w:r>
     </w:p>
     <w:p>
@@ -325,7 +325,7 @@
         <w:t xml:space="preserve"> </w:t>
       </w:r>
       <w:r>
-        <w:t xml:space="preserve">signature-ready PDF with direct blocks (p.11); DocuSign / SignWell / Dropbox Sign accepted.</w:t>
+        <w:t xml:space="preserve">signature-ready PDF with direct blocks (p.8); DocuSign / SignWell / Dropbox Sign accepted.</w:t>
       </w:r>
     </w:p>
     <w:p>
@@ -333,7 +333,7 @@
         <w:pStyle w:val="BodyText"/>
       </w:pPr>
       <w:r>
-        <w:t xml:space="preserve">Department-Wide Vision (full robust build incl. dept cabling, dept cameras, Room-405 bathroom &amp; raised floor) is on p.13 as the donor / naming-gift envelope at</w:t>
+        <w:t xml:space="preserve">Department-Wide Vision (full robust build incl. dept cabling, dept cameras, Room-405 bathroom &amp; raised floor) is on p.11 as the donor / naming-gift envelope at</w:t>
       </w:r>
       <w:r>
         <w:t xml:space="preserve"> </w:t>
@@ -411,7 +411,7 @@
         <w:t xml:space="preserve"> </w:t>
       </w:r>
       <w:r>
-        <w:t xml:space="preserve">voice (curriculum, p.12).</w:t>
+        <w:t xml:space="preserve">voice (curriculum, p.9).</w:t>
       </w:r>
     </w:p>
     <w:bookmarkEnd w:id="14"/>
@@ -470,7 +470,7 @@
         <w:t xml:space="preserve">Island Dev Crew Consulting · jon-isaac@islanddevcrew.com</w:t>
       </w:r>
       <w:r>
-        <w:t xml:space="preserve">Oakwood AI Lab Proposal · Page 1 of 12</w:t>
+        <w:t xml:space="preserve">Oakwood AI Lab Proposal · Page 1 of 13</w:t>
       </w:r>
     </w:p>
     <w:bookmarkStart w:id="16" w:name="executive-summary-how-to-read-this"/>
@@ -779,7 +779,7 @@
         <w:t xml:space="preserve"> </w:t>
       </w:r>
       <w:r>
-        <w:t xml:space="preserve">Room-405 bathroom). The number to commit to — top of the $150–175K band you targeted; the execute-ready invoice (p.11) bills this.</w:t>
+        <w:t xml:space="preserve">Room-405 bathroom). The number to commit to — top of the $150–175K band you targeted; the execute-ready invoice (p.8) bills this.</w:t>
       </w:r>
     </w:p>
     <w:bookmarkEnd w:id="17"/>
@@ -829,7 +829,7 @@
         <w:t xml:space="preserve"> </w:t>
       </w:r>
       <w:r>
-        <w:t xml:space="preserve">envelope (p.13).</w:t>
+        <w:t xml:space="preserve">envelope (p.11).</w:t>
       </w:r>
     </w:p>
     <w:bookmarkEnd w:id="18"/>
@@ -1170,7 +1170,7 @@
         <w:t xml:space="preserve">Island Dev Crew Consulting · jon-isaac@islanddevcrew.com</w:t>
       </w:r>
       <w:r>
-        <w:t xml:space="preserve">Oakwood AI Lab Proposal · Page 2 of 12</w:t>
+        <w:t xml:space="preserve">Oakwood AI Lab Proposal · Page 2 of 13</w:t>
       </w:r>
     </w:p>
     <w:bookmarkEnd w:id="21"/>
@@ -1188,7 +1188,23 @@
         <w:pStyle w:val="FirstParagraph"/>
       </w:pPr>
       <w:r>
-        <w:t xml:space="preserve">A true on-site assessment was performed with Dr. Smith and is documented by 71 verified photographs (exhibits, pp.6–7; full set + explanations on the online resource page). Room → lab mapping:</w:t>
+        <w:t xml:space="preserve">A true on-site assessment was performed with Dr. Smith and is documented by all</w:t>
+      </w:r>
+      <w:r>
+        <w:t xml:space="preserve"> </w:t>
+      </w:r>
+      <w:r>
+        <w:rPr>
+          <w:b/>
+          <w:bCs/>
+        </w:rPr>
+        <w:t xml:space="preserve">71 verified photographs</w:t>
+      </w:r>
+      <w:r>
+        <w:t xml:space="preserve"> </w:t>
+      </w:r>
+      <w:r>
+        <w:t xml:space="preserve">(16 isolated as exhibits on pp.4–5; the full set with explanations is on the online resource page). Room → lab mapping:</w:t>
       </w:r>
     </w:p>
     <w:tbl>
@@ -1561,12 +1577,12 @@
         <w:t xml:space="preserve">Island Dev Crew Consulting · jon-isaac@islanddevcrew.com</w:t>
       </w:r>
       <w:r>
-        <w:t xml:space="preserve">Oakwood AI Lab Proposal · Page 3 of 12</w:t>
+        <w:t xml:space="preserve">Oakwood AI Lab Proposal · Page 3 of 13</w:t>
       </w:r>
     </w:p>
     <w:bookmarkEnd w:id="22"/>
     <w:bookmarkEnd w:id="23"/>
-    <w:bookmarkStart w:id="55" w:name="X3f2acb1ed94b9b1b5b168a8be71882f6a6e49e5"/>
+    <w:bookmarkStart w:id="49" w:name="X3f2acb1ed94b9b1b5b168a8be71882f6a6e49e5"/>
     <w:p>
       <w:pPr>
         <w:pStyle w:val="Heading2"/>
@@ -1586,7 +1602,23 @@
         <w:pStyle w:val="FirstParagraph"/>
       </w:pPr>
       <w:r>
-        <w:t xml:space="preserve">Each photograph was individually reviewed; captions describe what is actually in frame. All 71 photographs at full resolution with explanations:</w:t>
+        <w:t xml:space="preserve">Each photograph was individually reviewed; captions describe what is actually in frame.</w:t>
+      </w:r>
+      <w:r>
+        <w:t xml:space="preserve"> </w:t>
+      </w:r>
+      <w:r>
+        <w:rPr>
+          <w:b/>
+          <w:bCs/>
+        </w:rPr>
+        <w:t xml:space="preserve">All 71 walkthrough photographs are included</w:t>
+      </w:r>
+      <w:r>
+        <w:t xml:space="preserve"> </w:t>
+      </w:r>
+      <w:r>
+        <w:t xml:space="preserve">at full resolution with explanations on the online resource page:</w:t>
       </w:r>
       <w:r>
         <w:t xml:space="preserve"> </w:t>
@@ -1665,7 +1697,7 @@
         <w:t xml:space="preserve"> </w:t>
       </w:r>
       <w:r>
-        <w:t xml:space="preserve">FPE panelboard 2C directory card, handwritten, showing circuits dominated by AC/heat and lighting loads for the 400-series rooms and hallways (incl. Rm 404-405, 409, 420). The</w:t>
+        <w:t xml:space="preserve">FPE panelboard 2C directory card, handwritten, showing circuits dominated by AC/heat and lighting loads for the 400-series rooms and hallways (incl. Rm 404-405, 409, 420)</w:t>
       </w:r>
     </w:p>
     <w:p>
@@ -1730,7 +1762,7 @@
         <w:t xml:space="preserve"> </w:t>
       </w:r>
       <w:r>
-        <w:t xml:space="preserve">Interior of FPE panel 2C with deadfront off: exposed bus bars and a mix of 15/20/25/30A single- and double-pole breakers hand-labeled to rooms 405, 409, 420 and hallway/AC zon</w:t>
+        <w:t xml:space="preserve">Interior of FPE panel 2C with deadfront off: exposed bus bars and a mix of 15/20/25/30A single- and double-pole breakers hand-labeled to rooms 405, 409, 420 and hallway/A</w:t>
       </w:r>
     </w:p>
     <w:p>
@@ -1795,7 +1827,7 @@
         <w:t xml:space="preserve"> </w:t>
       </w:r>
       <w:r>
-        <w:t xml:space="preserve">Sharp close-up of the FPE panel directory enumerating receptacle, plug-mold, dedicated-outlet, lab-table, fire-alarm, and '3D'-printer circuits across Rooms 404-420, with only</w:t>
+        <w:t xml:space="preserve">Sharp close-up of the FPE panel directory enumerating receptacle, plug-mold, dedicated-outlet, lab-table, fire-alarm, and '3D'-printer circuits across Rooms 404-420, with</w:t>
       </w:r>
     </w:p>
     <w:p>
@@ -1860,7 +1892,7 @@
         <w:t xml:space="preserve"> </w:t>
       </w:r>
       <w:r>
-        <w:t xml:space="preserve">Abandoned/exposed low-voltage drop: a surface-mount junction box with a loose twisted-pair (blue/yellow) hanging free and tucked behind the baseboard, not terminated in a prop</w:t>
+        <w:t xml:space="preserve">Abandoned/exposed low-voltage drop: a surface-mount junction box with a loose twisted-pair (blue/yellow) hanging free and tucked behind the baseboard, not terminated in a</w:t>
       </w:r>
     </w:p>
     <w:p>
@@ -1925,7 +1957,7 @@
         <w:t xml:space="preserve"> </w:t>
       </w:r>
       <w:r>
-        <w:t xml:space="preserve">MDF closet overview: a wall patch field and fiber breakout panel buried under unmanaged blue/gray/orange cabling routed through an open ceiling-tile gap, mounted on a bare woo</w:t>
+        <w:t xml:space="preserve">MDF closet overview: a wall patch field and fiber breakout panel buried under unmanaged blue/gray/orange cabling routed through an open ceiling-tile gap, mounted on a bar</w:t>
       </w:r>
     </w:p>
     <w:p>
@@ -1990,7 +2022,7 @@
         <w:t xml:space="preserve"> </w:t>
       </w:r>
       <w:r>
-        <w:t xml:space="preserve">Detail of the closet fiber distribution panel (rows A/B/C with red/blue couplers and yellow jumpers) beside a fiber-optic caution label and lone wall outlet, all on bare lumbe</w:t>
+        <w:t xml:space="preserve">Detail of the closet fiber distribution panel (rows A/B/C with red/blue couplers and yellow jumpers) beside a fiber-optic caution label and lone wall outlet, all on bare</w:t>
       </w:r>
     </w:p>
     <w:p>
@@ -2055,7 +2087,7 @@
         <w:t xml:space="preserve"> </w:t>
       </w:r>
       <w:r>
-        <w:t xml:space="preserve">Primary AV wall: large interactive flat-panel display on an articulating mount, a soundbar above it, and a markerboard alongside, with exposed cabling and a wall-mounted contr</w:t>
+        <w:t xml:space="preserve">Primary AV wall: large interactive flat-panel display on an articulating mount, a soundbar above it, and a markerboard alongside, with exposed cabling and a wall-mounted</w:t>
       </w:r>
     </w:p>
     <w:p>
@@ -2120,30 +2152,51 @@
         <w:t xml:space="preserve"> </w:t>
       </w:r>
       <w:r>
-        <w:t xml:space="preserve">Mobile computer cart labeled for Math &amp; Computer Science tethered by a single USB cable to a wall box, beside a wall-mounted flat panel with loose cabling. Shows reliance on a</w:t>
+        <w:t xml:space="preserve">Mobile computer cart labeled for Math &amp; Computer Science tethered by a single USB cable to a wall box, beside a wall-mounted flat panel with loose cabling. Shows reliance</w:t>
       </w:r>
     </w:p>
     <w:p>
       <w:pPr>
         <w:pStyle w:val="BodyText"/>
+      </w:pPr>
+      <w:r>
+        <w:t xml:space="preserve">Island Dev Crew Consulting · jon-isaac@islanddevcrew.com</w:t>
+      </w:r>
+      <w:r>
+        <w:t xml:space="preserve">Oakwood AI Lab Proposal · Page 4 of 13</w:t>
+      </w:r>
+    </w:p>
+    <w:bookmarkEnd w:id="49"/>
+    <w:bookmarkStart w:id="74" w:name="photo-exhibit-addendum-part-2-of-2"/>
+    <w:p>
+      <w:pPr>
+        <w:pStyle w:val="Heading2"/>
+      </w:pPr>
+      <w:r>
+        <w:t xml:space="preserve">7 · Photo Exhibit Addendum — Part 2 of 2</w:t>
+      </w:r>
+    </w:p>
+    <w:p>
+      <w:pPr>
+        <w:pStyle w:val="FirstParagraph"/>
       </w:pPr>
       <w:r>
         <w:drawing>
           <wp:inline>
             <wp:extent cx="5334000" cy="4000500"/>
             <wp:effectExtent b="0" l="0" r="0" t="0"/>
-            <wp:docPr descr="AV" title="" id="50" name="Picture"/>
+            <wp:docPr descr="AV" title="" id="51" name="Picture"/>
             <a:graphic>
               <a:graphicData uri="http://schemas.openxmlformats.org/drawingml/2006/picture">
                 <pic:pic>
                   <pic:nvPicPr>
-                    <pic:cNvPr descr="gallery/20260526_150306_HDR.jpg" id="51" name="Picture"/>
+                    <pic:cNvPr descr="gallery/20260526_150306_HDR.jpg" id="52" name="Picture"/>
                     <pic:cNvPicPr>
                       <a:picLocks noChangeArrowheads="1" noChangeAspect="1"/>
                     </pic:cNvPicPr>
                   </pic:nvPicPr>
                   <pic:blipFill>
-                    <a:blip r:embed="rId49"/>
+                    <a:blip r:embed="rId50"/>
                     <a:stretch>
                       <a:fillRect/>
                     </a:stretch>
@@ -2185,7 +2238,7 @@
         <w:t xml:space="preserve"> </w:t>
       </w:r>
       <w:r>
-        <w:t xml:space="preserve">Room 407 overview: rows of blue pegboard workbenches and stools beneath a recessed ceiling cassette AC unit and a ceiling-mounted projector, with two wall-mounted glass whiteb</w:t>
+        <w:t xml:space="preserve">Room 407 overview: rows of blue pegboard workbenches and stools beneath a recessed ceiling cassette AC unit and a ceiling-mounted projector, with two wall-mounted glass w</w:t>
       </w:r>
     </w:p>
     <w:p>
@@ -2197,18 +2250,18 @@
           <wp:inline>
             <wp:extent cx="5334000" cy="4000500"/>
             <wp:effectExtent b="0" l="0" r="0" t="0"/>
-            <wp:docPr descr="window" title="" id="53" name="Picture"/>
+            <wp:docPr descr="window" title="" id="54" name="Picture"/>
             <a:graphic>
               <a:graphicData uri="http://schemas.openxmlformats.org/drawingml/2006/picture">
                 <pic:pic>
                   <pic:nvPicPr>
-                    <pic:cNvPr descr="gallery/20260526_145829.jpg" id="54" name="Picture"/>
+                    <pic:cNvPr descr="gallery/20260526_145829.jpg" id="55" name="Picture"/>
                     <pic:cNvPicPr>
                       <a:picLocks noChangeArrowheads="1" noChangeAspect="1"/>
                     </pic:cNvPicPr>
                   </pic:nvPicPr>
                   <pic:blipFill>
-                    <a:blip r:embed="rId52"/>
+                    <a:blip r:embed="rId53"/>
                     <a:stretch>
                       <a:fillRect/>
                     </a:stretch>
@@ -2250,33 +2303,12 @@
         <w:t xml:space="preserve"> </w:t>
       </w:r>
       <w:r>
-        <w:t xml:space="preserve">Window head/jamb corner showing chalky deposit and streaking at the glazing perimeter where the seal meets the frame. Documents the window-reseal need and moisture/efflorescen</w:t>
+        <w:t xml:space="preserve">Window head/jamb corner showing chalky deposit and streaking at the glazing perimeter where the seal meets the frame. Documents the window-reseal need and moisture/efflor</w:t>
       </w:r>
     </w:p>
     <w:p>
       <w:pPr>
         <w:pStyle w:val="BodyText"/>
-      </w:pPr>
-      <w:r>
-        <w:t xml:space="preserve">Island Dev Crew Consulting · jon-isaac@islanddevcrew.com</w:t>
-      </w:r>
-      <w:r>
-        <w:t xml:space="preserve">Oakwood AI Lab Proposal · Page 4 of 12</w:t>
-      </w:r>
-    </w:p>
-    <w:bookmarkEnd w:id="55"/>
-    <w:bookmarkStart w:id="86" w:name="photo-exhibit-addendum-part-2-of-2"/>
-    <w:p>
-      <w:pPr>
-        <w:pStyle w:val="Heading2"/>
-      </w:pPr>
-      <w:r>
-        <w:t xml:space="preserve">7 · Photo Exhibit Addendum — Part 2 of 2</w:t>
-      </w:r>
-    </w:p>
-    <w:p>
-      <w:pPr>
-        <w:pStyle w:val="FirstParagraph"/>
       </w:pPr>
       <w:r>
         <w:drawing>
@@ -2336,7 +2368,7 @@
         <w:t xml:space="preserve"> </w:t>
       </w:r>
       <w:r>
-        <w:t xml:space="preserve">Window head detail showing failed glazing: pronounced interpane fogging across roughly half the pane and a marginal top seal against bare cinderblock, documenting the window r</w:t>
+        <w:t xml:space="preserve">Window head detail showing failed glazing: pronounced interpane fogging across roughly half the pane and a marginal top seal against bare cinderblock, documenting the win</w:t>
       </w:r>
     </w:p>
     <w:p>
@@ -2401,7 +2433,7 @@
         <w:t xml:space="preserve"> </w:t>
       </w:r>
       <w:r>
-        <w:t xml:space="preserve">Louvered wall grille over a window opening with bowed, misaligned blades and daylight leaking through gaps. Documents a damaged/ill-fitting louver assembly and a fenestration</w:t>
+        <w:t xml:space="preserve">Louvered wall grille over a window opening with bowed, misaligned blades and daylight leaking through gaps. Documents a damaged/ill-fitting louver assembly and a fenestra</w:t>
       </w:r>
     </w:p>
     <w:p>
@@ -2466,7 +2498,7 @@
         <w:t xml:space="preserve"> </w:t>
       </w:r>
       <w:r>
-        <w:t xml:space="preserve">Room 407 lab casework: continuous black-topped bench with stainless sink, faucet, and wood cabinetry. Only a single surface-mounted countertop duplex receptacle serves this en</w:t>
+        <w:t xml:space="preserve">Room 407 lab casework: continuous black-topped bench with stainless sink, faucet, and wood cabinetry. Only a single surface-mounted countertop duplex receptacle serves th</w:t>
       </w:r>
     </w:p>
     <w:p>
@@ -2531,7 +2563,7 @@
         <w:t xml:space="preserve"> </w:t>
       </w:r>
       <w:r>
-        <w:t xml:space="preserve">Detail of Room 407 workbench assets: heavy blue steel benches with pegboard backboards, lower storage shelves, and matching wheeled stools. Clean documentation of reusable ben</w:t>
+        <w:t xml:space="preserve">Detail of Room 407 workbench assets: heavy blue steel benches with pegboard backboards, lower storage shelves, and matching wheeled stools. Clean documentation of reusabl</w:t>
       </w:r>
     </w:p>
     <w:p>
@@ -2596,7 +2628,7 @@
         <w:t xml:space="preserve"> </w:t>
       </w:r>
       <w:r>
-        <w:t xml:space="preserve">Crisp close-up of the engineering 3D printers, clearly identifying the MakerBot Replicator and a second enclosed unit. Best documentation of the existing 3D-printer assets, wi</w:t>
+        <w:t xml:space="preserve">Crisp close-up of the engineering 3D printers, clearly identifying the MakerBot Replicator and a second enclosed unit. Best documentation of the existing 3D-printer asset</w:t>
       </w:r>
     </w:p>
     <w:p>
@@ -2661,7 +2693,7 @@
         <w:t xml:space="preserve"> </w:t>
       </w:r>
       <w:r>
-        <w:t xml:space="preserve">Wide view of a fully equipped computer classroom: rows of tower desktops with dual flat-panel monitors on shared desks, blue task chairs throughout. Strong asset exhibit docum</w:t>
+        <w:t xml:space="preserve">Wide view of a fully equipped computer classroom: rows of tower desktops with dual flat-panel monitors on shared desks, blue task chairs throughout. Strong asset exhibit</w:t>
       </w:r>
     </w:p>
     <w:p>
@@ -2669,267 +2701,7 @@
         <w:pStyle w:val="BodyText"/>
       </w:pPr>
       <w:r>
-        <w:drawing>
-          <wp:inline>
-            <wp:extent cx="5334000" cy="4000500"/>
-            <wp:effectExtent b="0" l="0" r="0" t="0"/>
-            <wp:docPr descr="printer" title="" id="75" name="Picture"/>
-            <a:graphic>
-              <a:graphicData uri="http://schemas.openxmlformats.org/drawingml/2006/picture">
-                <pic:pic>
-                  <pic:nvPicPr>
-                    <pic:cNvPr descr="gallery/20260526_151806.jpg" id="76" name="Picture"/>
-                    <pic:cNvPicPr>
-                      <a:picLocks noChangeArrowheads="1" noChangeAspect="1"/>
-                    </pic:cNvPicPr>
-                  </pic:nvPicPr>
-                  <pic:blipFill>
-                    <a:blip r:embed="rId74"/>
-                    <a:stretch>
-                      <a:fillRect/>
-                    </a:stretch>
-                  </pic:blipFill>
-                  <pic:spPr bwMode="auto">
-                    <a:xfrm>
-                      <a:off x="0" y="0"/>
-                      <a:ext cx="5334000" cy="4000500"/>
-                    </a:xfrm>
-                    <a:prstGeom prst="rect">
-                      <a:avLst/>
-                    </a:prstGeom>
-                    <a:noFill/>
-                    <a:ln w="9525">
-                      <a:noFill/>
-                      <a:headEnd/>
-                      <a:tailEnd/>
-                    </a:ln>
-                  </pic:spPr>
-                </pic:pic>
-              </a:graphicData>
-            </a:graphic>
-          </wp:inline>
-        </w:drawing>
-      </w:r>
-    </w:p>
-    <w:p>
-      <w:pPr>
-        <w:pStyle w:val="BodyText"/>
-      </w:pPr>
-      <w:r>
-        <w:rPr>
-          <w:b/>
-          <w:bCs/>
-        </w:rPr>
-        <w:t xml:space="preserve">EX-17 · printer · Engineering computer lab (Room:</w:t>
-      </w:r>
-      <w:r>
-        <w:t xml:space="preserve"> </w:t>
-      </w:r>
-      <w:r>
-        <w:t xml:space="preserve">Companion angle of the computer classroom showing the full row layout against bare white cinderblock and wood-plank floor. Clearly documents the quantity of existing desktop w</w:t>
-      </w:r>
-    </w:p>
-    <w:p>
-      <w:pPr>
-        <w:pStyle w:val="BodyText"/>
-      </w:pPr>
-      <w:r>
-        <w:drawing>
-          <wp:inline>
-            <wp:extent cx="5334000" cy="4000500"/>
-            <wp:effectExtent b="0" l="0" r="0" t="0"/>
-            <wp:docPr descr="room-overview" title="" id="78" name="Picture"/>
-            <a:graphic>
-              <a:graphicData uri="http://schemas.openxmlformats.org/drawingml/2006/picture">
-                <pic:pic>
-                  <pic:nvPicPr>
-                    <pic:cNvPr descr="gallery/20260526_145142.jpg" id="79" name="Picture"/>
-                    <pic:cNvPicPr>
-                      <a:picLocks noChangeArrowheads="1" noChangeAspect="1"/>
-                    </pic:cNvPicPr>
-                  </pic:nvPicPr>
-                  <pic:blipFill>
-                    <a:blip r:embed="rId77"/>
-                    <a:stretch>
-                      <a:fillRect/>
-                    </a:stretch>
-                  </pic:blipFill>
-                  <pic:spPr bwMode="auto">
-                    <a:xfrm>
-                      <a:off x="0" y="0"/>
-                      <a:ext cx="5334000" cy="4000500"/>
-                    </a:xfrm>
-                    <a:prstGeom prst="rect">
-                      <a:avLst/>
-                    </a:prstGeom>
-                    <a:noFill/>
-                    <a:ln w="9525">
-                      <a:noFill/>
-                      <a:headEnd/>
-                      <a:tailEnd/>
-                    </a:ln>
-                  </pic:spPr>
-                </pic:pic>
-              </a:graphicData>
-            </a:graphic>
-          </wp:inline>
-        </w:drawing>
-      </w:r>
-    </w:p>
-    <w:p>
-      <w:pPr>
-        <w:pStyle w:val="BodyText"/>
-      </w:pPr>
-      <w:r>
-        <w:rPr>
-          <w:b/>
-          <w:bCs/>
-        </w:rPr>
-        <w:t xml:space="preserve">EX-18 · room-overview · Room 407 (Math &amp; Soldering lab:</w:t>
-      </w:r>
-      <w:r>
-        <w:t xml:space="preserve"> </w:t>
-      </w:r>
-      <w:r>
-        <w:t xml:space="preserve">Corner of a bare-cinderblock room showing existing assets: a tall gray two-door metal storage cabinet (empty cabinetry), stacked chairs and folding-table legs, a rolling AV ca</w:t>
-      </w:r>
-    </w:p>
-    <w:p>
-      <w:pPr>
-        <w:pStyle w:val="BodyText"/>
-      </w:pPr>
-      <w:r>
-        <w:drawing>
-          <wp:inline>
-            <wp:extent cx="5334000" cy="4000500"/>
-            <wp:effectExtent b="0" l="0" r="0" t="0"/>
-            <wp:docPr descr="room-overview" title="" id="81" name="Picture"/>
-            <a:graphic>
-              <a:graphicData uri="http://schemas.openxmlformats.org/drawingml/2006/picture">
-                <pic:pic>
-                  <pic:nvPicPr>
-                    <pic:cNvPr descr="gallery/20260526_145703_HDR.jpg" id="82" name="Picture"/>
-                    <pic:cNvPicPr>
-                      <a:picLocks noChangeArrowheads="1" noChangeAspect="1"/>
-                    </pic:cNvPicPr>
-                  </pic:nvPicPr>
-                  <pic:blipFill>
-                    <a:blip r:embed="rId80"/>
-                    <a:stretch>
-                      <a:fillRect/>
-                    </a:stretch>
-                  </pic:blipFill>
-                  <pic:spPr bwMode="auto">
-                    <a:xfrm>
-                      <a:off x="0" y="0"/>
-                      <a:ext cx="5334000" cy="4000500"/>
-                    </a:xfrm>
-                    <a:prstGeom prst="rect">
-                      <a:avLst/>
-                    </a:prstGeom>
-                    <a:noFill/>
-                    <a:ln w="9525">
-                      <a:noFill/>
-                      <a:headEnd/>
-                      <a:tailEnd/>
-                    </a:ln>
-                  </pic:spPr>
-                </pic:pic>
-              </a:graphicData>
-            </a:graphic>
-          </wp:inline>
-        </w:drawing>
-      </w:r>
-    </w:p>
-    <w:p>
-      <w:pPr>
-        <w:pStyle w:val="BodyText"/>
-      </w:pPr>
-      <w:r>
-        <w:rPr>
-          <w:b/>
-          <w:bCs/>
-        </w:rPr>
-        <w:t xml:space="preserve">EX-19 · room-overview · Classroom (AI Studio candidate:</w:t>
-      </w:r>
-      <w:r>
-        <w:t xml:space="preserve"> </w:t>
-      </w:r>
-      <w:r>
-        <w:t xml:space="preserve">Wide overview of the candidate classroom: orange tablet-arm desks (one blue chair), a window with exterior greenery at left, a wall clock, and a dark exit door at right. A wal</w:t>
-      </w:r>
-    </w:p>
-    <w:p>
-      <w:pPr>
-        <w:pStyle w:val="BodyText"/>
-      </w:pPr>
-      <w:r>
-        <w:drawing>
-          <wp:inline>
-            <wp:extent cx="5334000" cy="4000500"/>
-            <wp:effectExtent b="0" l="0" r="0" t="0"/>
-            <wp:docPr descr="room-overview" title="" id="84" name="Picture"/>
-            <a:graphic>
-              <a:graphicData uri="http://schemas.openxmlformats.org/drawingml/2006/picture">
-                <pic:pic>
-                  <pic:nvPicPr>
-                    <pic:cNvPr descr="gallery/20260526_150349_HDR.jpg" id="85" name="Picture"/>
-                    <pic:cNvPicPr>
-                      <a:picLocks noChangeArrowheads="1" noChangeAspect="1"/>
-                    </pic:cNvPicPr>
-                  </pic:nvPicPr>
-                  <pic:blipFill>
-                    <a:blip r:embed="rId83"/>
-                    <a:stretch>
-                      <a:fillRect/>
-                    </a:stretch>
-                  </pic:blipFill>
-                  <pic:spPr bwMode="auto">
-                    <a:xfrm>
-                      <a:off x="0" y="0"/>
-                      <a:ext cx="5334000" cy="4000500"/>
-                    </a:xfrm>
-                    <a:prstGeom prst="rect">
-                      <a:avLst/>
-                    </a:prstGeom>
-                    <a:noFill/>
-                    <a:ln w="9525">
-                      <a:noFill/>
-                      <a:headEnd/>
-                      <a:tailEnd/>
-                    </a:ln>
-                  </pic:spPr>
-                </pic:pic>
-              </a:graphicData>
-            </a:graphic>
-          </wp:inline>
-        </w:drawing>
-      </w:r>
-    </w:p>
-    <w:p>
-      <w:pPr>
-        <w:pStyle w:val="BodyText"/>
-      </w:pPr>
-      <w:r>
-        <w:rPr>
-          <w:b/>
-          <w:bCs/>
-        </w:rPr>
-        <w:t xml:space="preserve">EX-20 · room-overview · Room 407 (Math &amp; Soldering lab:</w:t>
-      </w:r>
-      <w:r>
-        <w:t xml:space="preserve"> </w:t>
-      </w:r>
-      <w:r>
-        <w:t xml:space="preserve">Room 407 full overview showing bench density, glass whiteboard, doorway to hallway, and a wall-mounted HVAC unit. Strong context shot of the empty candidate lab's overall cond</w:t>
-      </w:r>
-    </w:p>
-    <w:p>
-      <w:pPr>
-        <w:pStyle w:val="BodyText"/>
-      </w:pPr>
-      <w:r>
-        <w:t xml:space="preserve">Remaining 51 exhibits (full set of 71) with room/condition explanations are on the online</w:t>
+        <w:t xml:space="preserve">These 16 are the strongest exhibits; the complete set of all 71 walkthrough photographs — with room/condition explanations — is on the online</w:t>
       </w:r>
       <w:r>
         <w:t xml:space="preserve"> </w:t>
@@ -2954,11 +2726,11 @@
         <w:t xml:space="preserve">Island Dev Crew Consulting · jon-isaac@islanddevcrew.com</w:t>
       </w:r>
       <w:r>
-        <w:t xml:space="preserve">Oakwood AI Lab Proposal · Page 5 of 12</w:t>
-      </w:r>
-    </w:p>
-    <w:bookmarkEnd w:id="86"/>
-    <w:bookmarkStart w:id="90" w:name="Xe6b9a1edb0274110b27552f09ec325829726063"/>
+        <w:t xml:space="preserve">Oakwood AI Lab Proposal · Page 5 of 13</w:t>
+      </w:r>
+    </w:p>
+    <w:bookmarkEnd w:id="74"/>
+    <w:bookmarkStart w:id="78" w:name="Xe6b9a1edb0274110b27552f09ec325829726063"/>
     <w:p>
       <w:pPr>
         <w:pStyle w:val="Heading2"/>
@@ -2973,7 +2745,7 @@
         <w:t xml:space="preserve">(Title III grant-eligible)</w:t>
       </w:r>
     </w:p>
-    <w:bookmarkStart w:id="87" w:name="ai-studio-rm-409"/>
+    <w:bookmarkStart w:id="75" w:name="ai-studio-rm-409"/>
     <w:p>
       <w:pPr>
         <w:pStyle w:val="Heading3"/>
@@ -3083,8 +2855,8 @@
         <w:t xml:space="preserve">. Keep the dual smartboards/2 projectors.</w:t>
       </w:r>
     </w:p>
-    <w:bookmarkEnd w:id="87"/>
-    <w:bookmarkStart w:id="88" w:name="math-soldering-rm-407"/>
+    <w:bookmarkEnd w:id="75"/>
+    <w:bookmarkStart w:id="76" w:name="math-soldering-rm-407"/>
     <w:p>
       <w:pPr>
         <w:pStyle w:val="Heading3"/>
@@ -3140,8 +2912,8 @@
         <w:t xml:space="preserve">CNC. Reuses the existing blue pegboard benches + cabinetry.</w:t>
       </w:r>
     </w:p>
-    <w:bookmarkEnd w:id="88"/>
-    <w:bookmarkStart w:id="89" w:name="engineering-rm-305-310"/>
+    <w:bookmarkEnd w:id="76"/>
+    <w:bookmarkStart w:id="77" w:name="engineering-rm-305-310"/>
     <w:p>
       <w:pPr>
         <w:pStyle w:val="Heading3"/>
@@ -3226,7 +2998,7 @@
         <w:t xml:space="preserve">in 310 for AI hosting (10GbE NICs, RAM, IP-KVM) — engineering compute for near-zero new spend.</w:t>
       </w:r>
     </w:p>
-    <w:bookmarkEnd w:id="89"/>
+    <w:bookmarkEnd w:id="77"/>
     <w:tbl>
       <w:tblPr>
         <w:tblStyle w:val="Table"/>
@@ -3552,11 +3324,11 @@
         <w:t xml:space="preserve">Island Dev Crew Consulting · jon-isaac@islanddevcrew.com</w:t>
       </w:r>
       <w:r>
-        <w:t xml:space="preserve">Oakwood AI Lab Proposal · Page 6 of 12</w:t>
-      </w:r>
-    </w:p>
-    <w:bookmarkEnd w:id="90"/>
-    <w:bookmarkStart w:id="91" w:name="X6004b15c1cd53996470fecea6e6de1927c90cdd"/>
+        <w:t xml:space="preserve">Oakwood AI Lab Proposal · Page 6 of 13</w:t>
+      </w:r>
+    </w:p>
+    <w:bookmarkEnd w:id="78"/>
+    <w:bookmarkStart w:id="79" w:name="X6004b15c1cd53996470fecea6e6de1927c90cdd"/>
     <w:p>
       <w:pPr>
         <w:pStyle w:val="Heading2"/>
@@ -3693,8 +3465,8 @@
         <w:t xml:space="preserve">Madison Electric, Pro Electric, Lee Company, Blake Brothers, Urban Electric.</w:t>
       </w:r>
     </w:p>
-    <w:bookmarkEnd w:id="91"/>
-    <w:bookmarkStart w:id="92" w:name="Xe0f3cba5bc94cbd333cacfabda868309a467063"/>
+    <w:bookmarkEnd w:id="79"/>
+    <w:bookmarkStart w:id="80" w:name="Xe0f3cba5bc94cbd333cacfabda868309a467063"/>
     <w:p>
       <w:pPr>
         <w:pStyle w:val="Heading2"/>
@@ -4029,11 +3801,11 @@
         <w:t xml:space="preserve">Island Dev Crew Consulting · jon-isaac@islanddevcrew.com</w:t>
       </w:r>
       <w:r>
-        <w:t xml:space="preserve">Oakwood AI Lab Proposal · Page 7 of 12</w:t>
-      </w:r>
-    </w:p>
-    <w:bookmarkEnd w:id="92"/>
-    <w:bookmarkStart w:id="95" w:name="Xb2eba27ccd3389cd7fd58b6ed635352a7c568da"/>
+        <w:t xml:space="preserve">Oakwood AI Lab Proposal · Page 7 of 13</w:t>
+      </w:r>
+    </w:p>
+    <w:bookmarkEnd w:id="80"/>
+    <w:bookmarkStart w:id="83" w:name="Xb2eba27ccd3389cd7fd58b6ed635352a7c568da"/>
     <w:p>
       <w:pPr>
         <w:pStyle w:val="Heading2"/>
@@ -4858,7 +4630,7 @@
         </w:tc>
       </w:tr>
     </w:tbl>
-    <w:bookmarkStart w:id="93" w:name="payment-schedule-proposed"/>
+    <w:bookmarkStart w:id="81" w:name="payment-schedule-proposed"/>
     <w:p>
       <w:pPr>
         <w:pStyle w:val="Heading3"/>
@@ -4962,8 +4734,8 @@
         <w:t xml:space="preserve">($68,000)</w:t>
       </w:r>
     </w:p>
-    <w:bookmarkEnd w:id="93"/>
-    <w:bookmarkStart w:id="94" w:name="acceptance-signatures"/>
+    <w:bookmarkEnd w:id="81"/>
+    <w:bookmarkStart w:id="82" w:name="acceptance-signatures"/>
     <w:p>
       <w:pPr>
         <w:pStyle w:val="Heading3"/>
@@ -5060,7 +4832,7 @@
         <w:t xml:space="preserve">Signature / Date</w:t>
       </w:r>
     </w:p>
-    <w:bookmarkEnd w:id="94"/>
+    <w:bookmarkEnd w:id="82"/>
     <w:p>
       <w:pPr>
         <w:pStyle w:val="BodyText"/>
@@ -5069,11 +4841,11 @@
         <w:t xml:space="preserve">Island Dev Crew Consulting · jon-isaac@islanddevcrew.com</w:t>
       </w:r>
       <w:r>
-        <w:t xml:space="preserve">Oakwood AI Lab Invoice · Page 8 of 12</w:t>
-      </w:r>
-    </w:p>
-    <w:bookmarkEnd w:id="95"/>
-    <w:bookmarkStart w:id="98" w:name="X85abddfede38e425dd2282f8c04207291314699"/>
+        <w:t xml:space="preserve">Oakwood AI Lab Invoice · Page 8 of 13</w:t>
+      </w:r>
+    </w:p>
+    <w:bookmarkEnd w:id="83"/>
+    <w:bookmarkStart w:id="84" w:name="X85abddfede38e425dd2282f8c04207291314699"/>
     <w:p>
       <w:pPr>
         <w:pStyle w:val="Heading2"/>
@@ -5125,7 +4897,36 @@
         <w:t xml:space="preserve"> </w:t>
       </w:r>
       <w:r>
-        <w:t xml:space="preserve">(Updated &amp; Expanded Ed., John C. Lennox, Zondervan Reflective 2024) — chosen over the 2020 original because it engages the generative-AI/LLM era. Companion: the</w:t>
+        <w:t xml:space="preserve">(Updated &amp; Expanded Ed., John C. Lennox, Zondervan Reflective 2024). The class meets</w:t>
+      </w:r>
+      <w:r>
+        <w:t xml:space="preserve"> </w:t>
+      </w:r>
+      <w:r>
+        <w:rPr>
+          <w:b/>
+          <w:bCs/>
+        </w:rPr>
+        <w:t xml:space="preserve">twice weekly</w:t>
+      </w:r>
+      <w:r>
+        <w:t xml:space="preserve"> </w:t>
+      </w:r>
+      <w:r>
+        <w:t xml:space="preserve">(e.g., Mon/Wed or Tue/Thu);</w:t>
+      </w:r>
+      <w:r>
+        <w:t xml:space="preserve"> </w:t>
+      </w:r>
+      <w:r>
+        <w:rPr>
+          <w:b/>
+          <w:bCs/>
+        </w:rPr>
+        <w:t xml:space="preserve">one chapter is discussed per session — ~2 chapters/week</w:t>
+      </w:r>
+      <w:r>
+        <w:t xml:space="preserve">, so the cohort reads</w:t>
       </w:r>
       <w:r>
         <w:t xml:space="preserve"> </w:t>
@@ -5135,29 +4936,52 @@
           <w:i/>
           <w:iCs/>
         </w:rPr>
-        <w:t xml:space="preserve">2084</w:t>
-      </w:r>
-      <w:r>
-        <w:t xml:space="preserve"> </w:t>
-      </w:r>
-      <w:r>
-        <w:t xml:space="preserve">13-session Video Study for a flipped classroom. Two interleaved courses share one ethics spine; every 1–2 weeks ships one of</w:t>
-      </w:r>
-      <w:r>
-        <w:t xml:space="preserve"> </w:t>
-      </w:r>
-      <w:r>
-        <w:rPr>
-          <w:b/>
-          <w:bCs/>
-        </w:rPr>
-        <w:t xml:space="preserve">8 portfolio projects</w:t>
-      </w:r>
-      <w:r>
-        <w:t xml:space="preserve"> </w:t>
-      </w:r>
-      <w:r>
-        <w:t xml:space="preserve">("students don't study AI — they ship it").</w:t>
+        <w:t xml:space="preserve">through the whole book</w:t>
+      </w:r>
+      <w:r>
+        <w:t xml:space="preserve"> </w:t>
+      </w:r>
+      <w:r>
+        <w:t xml:space="preserve">over the term while every 1–2 weeks ships one of</w:t>
+      </w:r>
+      <w:r>
+        <w:t xml:space="preserve"> </w:t>
+      </w:r>
+      <w:r>
+        <w:rPr>
+          <w:b/>
+          <w:bCs/>
+        </w:rPr>
+        <w:t xml:space="preserve">8 portfolio products</w:t>
+      </w:r>
+      <w:r>
+        <w:t xml:space="preserve">. Two interleaved courses (</w:t>
+      </w:r>
+      <w:r>
+        <w:rPr>
+          <w:b/>
+          <w:bCs/>
+        </w:rPr>
+        <w:t xml:space="preserve">AI Engineering</w:t>
+      </w:r>
+      <w:r>
+        <w:t xml:space="preserve"> </w:t>
+      </w:r>
+      <w:r>
+        <w:t xml:space="preserve">+</w:t>
+      </w:r>
+      <w:r>
+        <w:t xml:space="preserve"> </w:t>
+      </w:r>
+      <w:r>
+        <w:rPr>
+          <w:b/>
+          <w:bCs/>
+        </w:rPr>
+        <w:t xml:space="preserve">hands-on Machining/CNC</w:t>
+      </w:r>
+      <w:r>
+        <w:t xml:space="preserve">) share this one ethics seminar. Pricing &amp; outcomes on p.10.</w:t>
       </w:r>
     </w:p>
     <w:tbl>
@@ -5194,29 +5018,29 @@
               <w:pStyle w:val="Compact"/>
             </w:pPr>
             <w:r>
-              <w:t xml:space="preserve">Ethics seminar (Lennox)</w:t>
-            </w:r>
-          </w:p>
-        </w:tc>
-        <w:tc>
-          <w:tcPr/>
-          <w:p>
-            <w:pPr>
-              <w:pStyle w:val="Compact"/>
-            </w:pPr>
-            <w:r>
-              <w:t xml:space="preserve">AI Engineering (Rm 409/310)</w:t>
-            </w:r>
-          </w:p>
-        </w:tc>
-        <w:tc>
-          <w:tcPr/>
-          <w:p>
-            <w:pPr>
-              <w:pStyle w:val="Compact"/>
-            </w:pPr>
-            <w:r>
-              <w:t xml:space="preserve">Project shipped</w:t>
+              <w:t xml:space="preserve">Ethics seminar — Lennox (≈2 ch/wk)</w:t>
+            </w:r>
+          </w:p>
+        </w:tc>
+        <w:tc>
+          <w:tcPr/>
+          <w:p>
+            <w:pPr>
+              <w:pStyle w:val="Compact"/>
+            </w:pPr>
+            <w:r>
+              <w:t xml:space="preserve">AI Engineering room (Rm 409 / 310) + fabrication (407 / 305)</w:t>
+            </w:r>
+          </w:p>
+        </w:tc>
+        <w:tc>
+          <w:tcPr/>
+          <w:p>
+            <w:pPr>
+              <w:pStyle w:val="Compact"/>
+            </w:pPr>
+            <w:r>
+              <w:t xml:space="preserve">Product shipped</w:t>
             </w:r>
           </w:p>
         </w:tc>
@@ -5240,18 +5064,34 @@
               <w:pStyle w:val="Compact"/>
             </w:pPr>
             <w:r>
-              <w:t xml:space="preserve">Ch.1 Mapping the territory</w:t>
-            </w:r>
-          </w:p>
-        </w:tc>
-        <w:tc>
-          <w:tcPr/>
-          <w:p>
-            <w:pPr>
-              <w:pStyle w:val="Compact"/>
-            </w:pPr>
-            <w:r>
-              <w:t xml:space="preserve">Onboarding; Python/Git; local vs cloud LLM</w:t>
+              <w:t xml:space="preserve">Ch 1–2 · Mapping AI + where we come from</w:t>
+            </w:r>
+          </w:p>
+        </w:tc>
+        <w:tc>
+          <w:tcPr/>
+          <w:p>
+            <w:pPr>
+              <w:pStyle w:val="Compact"/>
+            </w:pPr>
+            <w:r>
+              <w:t xml:space="preserve">Onboarding · Python/Git · first</w:t>
+            </w:r>
+            <w:r>
+              <w:t xml:space="preserve"> </w:t>
+            </w:r>
+            <w:r>
+              <w:rPr>
+                <w:i/>
+                <w:iCs/>
+              </w:rPr>
+              <w:t xml:space="preserve">local</w:t>
+            </w:r>
+            <w:r>
+              <w:t xml:space="preserve"> </w:t>
+            </w:r>
+            <w:r>
+              <w:t xml:space="preserve">LLM on the Rm 310 GPUs; local-vs-cloud</w:t>
             </w:r>
           </w:p>
         </w:tc>
@@ -5286,18 +5126,18 @@
               <w:pStyle w:val="Compact"/>
             </w:pPr>
             <w:r>
-              <w:t xml:space="preserve">Ch.2–3 Origins / surveillance</w:t>
-            </w:r>
-          </w:p>
-        </w:tc>
-        <w:tc>
-          <w:tcPr/>
-          <w:p>
-            <w:pPr>
-              <w:pStyle w:val="Compact"/>
-            </w:pPr>
-            <w:r>
-              <w:t xml:space="preserve">RAG chatbot on a local model (Rm 310 GPUs)</w:t>
+              <w:t xml:space="preserve">Ch 3–4 · Trajectory / surveillance + narrow-AI promise</w:t>
+            </w:r>
+          </w:p>
+        </w:tc>
+        <w:tc>
+          <w:tcPr/>
+          <w:p>
+            <w:pPr>
+              <w:pStyle w:val="Compact"/>
+            </w:pPr>
+            <w:r>
+              <w:t xml:space="preserve">Build a RAG assistant on a local model; prompt &amp; retrieval basics</w:t>
             </w:r>
           </w:p>
         </w:tc>
@@ -5312,7 +5152,13 @@
                 <w:b/>
                 <w:bCs/>
               </w:rPr>
-              <w:t xml:space="preserve">P1 Local RAG assistant</w:t>
+              <w:t xml:space="preserve">P1</w:t>
+            </w:r>
+            <w:r>
+              <w:t xml:space="preserve"> </w:t>
+            </w:r>
+            <w:r>
+              <w:t xml:space="preserve">Local RAG assistant</w:t>
             </w:r>
           </w:p>
         </w:tc>
@@ -5325,18 +5171,18 @@
               <w:pStyle w:val="Compact"/>
             </w:pPr>
             <w:r>
-              <w:t xml:space="preserve">3–4</w:t>
-            </w:r>
-          </w:p>
-        </w:tc>
-        <w:tc>
-          <w:tcPr/>
-          <w:p>
-            <w:pPr>
-              <w:pStyle w:val="Compact"/>
-            </w:pPr>
-            <w:r>
-              <w:t xml:space="preserve">Ch.4–5 Narrow AI: promise &amp; bias</w:t>
+              <w:t xml:space="preserve">3</w:t>
+            </w:r>
+          </w:p>
+        </w:tc>
+        <w:tc>
+          <w:tcPr/>
+          <w:p>
+            <w:pPr>
+              <w:pStyle w:val="Compact"/>
+            </w:pPr>
+            <w:r>
+              <w:t xml:space="preserve">Ch 5–6 · Narrow-AI harms &amp; bias + upgrading humans</w:t>
             </w:r>
           </w:p>
         </w:tc>
@@ -5362,7 +5208,13 @@
                 <w:b/>
                 <w:bCs/>
               </w:rPr>
-              <w:t xml:space="preserve">P2 CV model + bias audit</w:t>
+              <w:t xml:space="preserve">P2</w:t>
+            </w:r>
+            <w:r>
+              <w:t xml:space="preserve"> </w:t>
+            </w:r>
+            <w:r>
+              <w:t xml:space="preserve">CV model + bias audit</w:t>
             </w:r>
           </w:p>
         </w:tc>
@@ -5375,6 +5227,52 @@
               <w:pStyle w:val="Compact"/>
             </w:pPr>
             <w:r>
+              <w:t xml:space="preserve">4</w:t>
+            </w:r>
+          </w:p>
+        </w:tc>
+        <w:tc>
+          <w:tcPr/>
+          <w:p>
+            <w:pPr>
+              <w:pStyle w:val="Compact"/>
+            </w:pPr>
+            <w:r>
+              <w:t xml:space="preserve">Ch 7–8 · AGI risk + what is a human being</w:t>
+            </w:r>
+          </w:p>
+        </w:tc>
+        <w:tc>
+          <w:tcPr/>
+          <w:p>
+            <w:pPr>
+              <w:pStyle w:val="Compact"/>
+            </w:pPr>
+            <w:r>
+              <w:t xml:space="preserve">Agentic workflow (tool-use) + guardrails; prompt-injection red-team</w:t>
+            </w:r>
+          </w:p>
+        </w:tc>
+        <w:tc>
+          <w:tcPr/>
+          <w:p>
+            <w:pPr>
+              <w:pStyle w:val="Compact"/>
+            </w:pPr>
+            <w:r>
+              <w:t xml:space="preserve">—</w:t>
+            </w:r>
+          </w:p>
+        </w:tc>
+      </w:tr>
+      <w:tr>
+        <w:tc>
+          <w:tcPr/>
+          <w:p>
+            <w:pPr>
+              <w:pStyle w:val="Compact"/>
+            </w:pPr>
+            <w:r>
               <w:t xml:space="preserve">5</w:t>
             </w:r>
           </w:p>
@@ -5386,18 +5284,18 @@
               <w:pStyle w:val="Compact"/>
             </w:pPr>
             <w:r>
-              <w:t xml:space="preserve">Ch.6 Upgrading humans</w:t>
-            </w:r>
-          </w:p>
-        </w:tc>
-        <w:tc>
-          <w:tcPr/>
-          <w:p>
-            <w:pPr>
-              <w:pStyle w:val="Compact"/>
-            </w:pPr>
-            <w:r>
-              <w:t xml:space="preserve">Voice agent; assistive-tech use case + fabricate device</w:t>
+              <w:t xml:space="preserve">Ch 9–10 · Origin of moral sense + the true Homo Deus</w:t>
+            </w:r>
+          </w:p>
+        </w:tc>
+        <w:tc>
+          <w:tcPr/>
+          <w:p>
+            <w:pPr>
+              <w:pStyle w:val="Compact"/>
+            </w:pPr>
+            <w:r>
+              <w:t xml:space="preserve">Voice/assistive-tech device — AI + a 3D-printed part on the Bambu fleet</w:t>
             </w:r>
           </w:p>
         </w:tc>
@@ -5412,7 +5310,13 @@
                 <w:b/>
                 <w:bCs/>
               </w:rPr>
-              <w:t xml:space="preserve">P3 Assistive-tech AI device</w:t>
+              <w:t xml:space="preserve">P3</w:t>
+            </w:r>
+            <w:r>
+              <w:t xml:space="preserve"> </w:t>
+            </w:r>
+            <w:r>
+              <w:t xml:space="preserve">Assistive-tech AI device</w:t>
             </w:r>
           </w:p>
         </w:tc>
@@ -5425,29 +5329,29 @@
               <w:pStyle w:val="Compact"/>
             </w:pPr>
             <w:r>
-              <w:t xml:space="preserve">6–7</w:t>
-            </w:r>
-          </w:p>
-        </w:tc>
-        <w:tc>
-          <w:tcPr/>
-          <w:p>
-            <w:pPr>
-              <w:pStyle w:val="Compact"/>
-            </w:pPr>
-            <w:r>
-              <w:t xml:space="preserve">Ch.7–8 AGI risk / personhood</w:t>
-            </w:r>
-          </w:p>
-        </w:tc>
-        <w:tc>
-          <w:tcPr/>
-          <w:p>
-            <w:pPr>
-              <w:pStyle w:val="Compact"/>
-            </w:pPr>
-            <w:r>
-              <w:t xml:space="preserve">Agentic workflow + guardrails; multimodal app deploy</w:t>
+              <w:t xml:space="preserve">6</w:t>
+            </w:r>
+          </w:p>
+        </w:tc>
+        <w:tc>
+          <w:tcPr/>
+          <w:p>
+            <w:pPr>
+              <w:pStyle w:val="Compact"/>
+            </w:pPr>
+            <w:r>
+              <w:t xml:space="preserve">Ch 11–12 · Future shock / revelation</w:t>
+            </w:r>
+          </w:p>
+        </w:tc>
+        <w:tc>
+          <w:tcPr/>
+          <w:p>
+            <w:pPr>
+              <w:pStyle w:val="Compact"/>
+            </w:pPr>
+            <w:r>
+              <w:t xml:space="preserve">Multimodal app; deploy to Vercel with a Supabase backend</w:t>
             </w:r>
           </w:p>
         </w:tc>
@@ -5462,7 +5366,13 @@
                 <w:b/>
                 <w:bCs/>
               </w:rPr>
-              <w:t xml:space="preserve">P4 Agentic app w/ guardrails</w:t>
+              <w:t xml:space="preserve">P4</w:t>
+            </w:r>
+            <w:r>
+              <w:t xml:space="preserve"> </w:t>
+            </w:r>
+            <w:r>
+              <w:t xml:space="preserve">Deployed multimodal app</w:t>
             </w:r>
           </w:p>
         </w:tc>
@@ -5475,29 +5385,29 @@
               <w:pStyle w:val="Compact"/>
             </w:pPr>
             <w:r>
-              <w:t xml:space="preserve">8–9</w:t>
-            </w:r>
-          </w:p>
-        </w:tc>
-        <w:tc>
-          <w:tcPr/>
-          <w:p>
-            <w:pPr>
-              <w:pStyle w:val="Compact"/>
-            </w:pPr>
-            <w:r>
-              <w:t xml:space="preserve">Ch.9 Origin of moral sense</w:t>
-            </w:r>
-          </w:p>
-        </w:tc>
-        <w:tc>
-          <w:tcPr/>
-          <w:p>
-            <w:pPr>
-              <w:pStyle w:val="Compact"/>
-            </w:pPr>
-            <w:r>
-              <w:t xml:space="preserve">Eval harness; red-team; responsible-AI write-up</w:t>
+              <w:t xml:space="preserve">7</w:t>
+            </w:r>
+          </w:p>
+        </w:tc>
+        <w:tc>
+          <w:tcPr/>
+          <w:p>
+            <w:pPr>
+              <w:pStyle w:val="Compact"/>
+            </w:pPr>
+            <w:r>
+              <w:t xml:space="preserve">Ch 13 + synthesis · responsible AI &amp; the time of the end</w:t>
+            </w:r>
+          </w:p>
+        </w:tc>
+        <w:tc>
+          <w:tcPr/>
+          <w:p>
+            <w:pPr>
+              <w:pStyle w:val="Compact"/>
+            </w:pPr>
+            <w:r>
+              <w:t xml:space="preserve">Eval harness + red-team; responsible-AI governance memo; demo-board publish</w:t>
             </w:r>
           </w:p>
         </w:tc>
@@ -5512,7 +5422,13 @@
                 <w:b/>
                 <w:bCs/>
               </w:rPr>
-              <w:t xml:space="preserve">P5–P6 Eval + governance memo</w:t>
+              <w:t xml:space="preserve">P5</w:t>
+            </w:r>
+            <w:r>
+              <w:t xml:space="preserve"> </w:t>
+            </w:r>
+            <w:r>
+              <w:t xml:space="preserve">Eval + governance memo</w:t>
             </w:r>
           </w:p>
         </w:tc>
@@ -5525,29 +5441,29 @@
               <w:pStyle w:val="Compact"/>
             </w:pPr>
             <w:r>
-              <w:t xml:space="preserve">10–12</w:t>
-            </w:r>
-          </w:p>
-        </w:tc>
-        <w:tc>
-          <w:tcPr/>
-          <w:p>
-            <w:pPr>
-              <w:pStyle w:val="Compact"/>
-            </w:pPr>
-            <w:r>
-              <w:t xml:space="preserve">Ch.10–13 Homo Deus / Revelation</w:t>
-            </w:r>
-          </w:p>
-        </w:tc>
-        <w:tc>
-          <w:tcPr/>
-          <w:p>
-            <w:pPr>
-              <w:pStyle w:val="Compact"/>
-            </w:pPr>
-            <w:r>
-              <w:t xml:space="preserve">Capstone: ship a campus tool (à la Campus Companion)</w:t>
+              <w:t xml:space="preserve">8</w:t>
+            </w:r>
+          </w:p>
+        </w:tc>
+        <w:tc>
+          <w:tcPr/>
+          <w:p>
+            <w:pPr>
+              <w:pStyle w:val="Compact"/>
+            </w:pPr>
+            <w:r>
+              <w:t xml:space="preserve">Applied sprint · ethics review embedded in code review</w:t>
+            </w:r>
+          </w:p>
+        </w:tc>
+        <w:tc>
+          <w:tcPr/>
+          <w:p>
+            <w:pPr>
+              <w:pStyle w:val="Compact"/>
+            </w:pPr>
+            <w:r>
+              <w:t xml:space="preserve">Business / SaaS build: auth, database, billing</w:t>
             </w:r>
           </w:p>
         </w:tc>
@@ -5562,19 +5478,645 @@
                 <w:b/>
                 <w:bCs/>
               </w:rPr>
-              <w:t xml:space="preserve">P7–P8 Capstone + demo day</w:t>
+              <w:t xml:space="preserve">P6</w:t>
+            </w:r>
+            <w:r>
+              <w:t xml:space="preserve"> </w:t>
+            </w:r>
+            <w:r>
+              <w:t xml:space="preserve">SaaS product</w:t>
+            </w:r>
+          </w:p>
+        </w:tc>
+      </w:tr>
+      <w:tr>
+        <w:tc>
+          <w:tcPr/>
+          <w:p>
+            <w:pPr>
+              <w:pStyle w:val="Compact"/>
+            </w:pPr>
+            <w:r>
+              <w:t xml:space="preserve">9</w:t>
+            </w:r>
+          </w:p>
+        </w:tc>
+        <w:tc>
+          <w:tcPr/>
+          <w:p>
+            <w:pPr>
+              <w:pStyle w:val="Compact"/>
+            </w:pPr>
+            <w:r>
+              <w:t xml:space="preserve">Applied sprint</w:t>
+            </w:r>
+          </w:p>
+        </w:tc>
+        <w:tc>
+          <w:tcPr/>
+          <w:p>
+            <w:pPr>
+              <w:pStyle w:val="Compact"/>
+            </w:pPr>
+            <w:r>
+              <w:t xml:space="preserve">Agentic product via OpenRouter multi-model routing (local + frontier)</w:t>
+            </w:r>
+          </w:p>
+        </w:tc>
+        <w:tc>
+          <w:tcPr/>
+          <w:p>
+            <w:pPr>
+              <w:pStyle w:val="Compact"/>
+            </w:pPr>
+            <w:r>
+              <w:t xml:space="preserve">—</w:t>
+            </w:r>
+          </w:p>
+        </w:tc>
+      </w:tr>
+      <w:tr>
+        <w:tc>
+          <w:tcPr/>
+          <w:p>
+            <w:pPr>
+              <w:pStyle w:val="Compact"/>
+            </w:pPr>
+            <w:r>
+              <w:t xml:space="preserve">10</w:t>
+            </w:r>
+          </w:p>
+        </w:tc>
+        <w:tc>
+          <w:tcPr/>
+          <w:p>
+            <w:pPr>
+              <w:pStyle w:val="Compact"/>
+            </w:pPr>
+            <w:r>
+              <w:t xml:space="preserve">Publication / research artifact</w:t>
+            </w:r>
+          </w:p>
+        </w:tc>
+        <w:tc>
+          <w:tcPr/>
+          <w:p>
+            <w:pPr>
+              <w:pStyle w:val="Compact"/>
+            </w:pPr>
+            <w:r>
+              <w:t xml:space="preserve">Technical write-up + research poster; hallway demo board</w:t>
+            </w:r>
+          </w:p>
+        </w:tc>
+        <w:tc>
+          <w:tcPr/>
+          <w:p>
+            <w:pPr>
+              <w:pStyle w:val="Compact"/>
+            </w:pPr>
+            <w:r>
+              <w:rPr>
+                <w:b/>
+                <w:bCs/>
+              </w:rPr>
+              <w:t xml:space="preserve">P7</w:t>
+            </w:r>
+            <w:r>
+              <w:t xml:space="preserve"> </w:t>
+            </w:r>
+            <w:r>
+              <w:t xml:space="preserve">Publication / poster</w:t>
+            </w:r>
+          </w:p>
+        </w:tc>
+      </w:tr>
+      <w:tr>
+        <w:tc>
+          <w:tcPr/>
+          <w:p>
+            <w:pPr>
+              <w:pStyle w:val="Compact"/>
+            </w:pPr>
+            <w:r>
+              <w:t xml:space="preserve">11</w:t>
+            </w:r>
+          </w:p>
+        </w:tc>
+        <w:tc>
+          <w:tcPr/>
+          <w:p>
+            <w:pPr>
+              <w:pStyle w:val="Compact"/>
+            </w:pPr>
+            <w:r>
+              <w:t xml:space="preserve">Capstone build</w:t>
+            </w:r>
+          </w:p>
+        </w:tc>
+        <w:tc>
+          <w:tcPr/>
+          <w:p>
+            <w:pPr>
+              <w:pStyle w:val="Compact"/>
+            </w:pPr>
+            <w:r>
+              <w:t xml:space="preserve">Ship a real campus tool (à la the OU Campus Companion)</w:t>
+            </w:r>
+          </w:p>
+        </w:tc>
+        <w:tc>
+          <w:tcPr/>
+          <w:p>
+            <w:pPr>
+              <w:pStyle w:val="Compact"/>
+            </w:pPr>
+            <w:r>
+              <w:t xml:space="preserve">—</w:t>
+            </w:r>
+          </w:p>
+        </w:tc>
+      </w:tr>
+      <w:tr>
+        <w:tc>
+          <w:tcPr/>
+          <w:p>
+            <w:pPr>
+              <w:pStyle w:val="Compact"/>
+            </w:pPr>
+            <w:r>
+              <w:t xml:space="preserve">12</w:t>
+            </w:r>
+          </w:p>
+        </w:tc>
+        <w:tc>
+          <w:tcPr/>
+          <w:p>
+            <w:pPr>
+              <w:pStyle w:val="Compact"/>
+            </w:pPr>
+            <w:r>
+              <w:t xml:space="preserve">Capstone demo day</w:t>
+            </w:r>
+          </w:p>
+        </w:tc>
+        <w:tc>
+          <w:tcPr/>
+          <w:p>
+            <w:pPr>
+              <w:pStyle w:val="Compact"/>
+            </w:pPr>
+            <w:r>
+              <w:t xml:space="preserve">Polish + portfolio site; present the 8-product portfolio</w:t>
+            </w:r>
+          </w:p>
+        </w:tc>
+        <w:tc>
+          <w:tcPr/>
+          <w:p>
+            <w:pPr>
+              <w:pStyle w:val="Compact"/>
+            </w:pPr>
+            <w:r>
+              <w:rPr>
+                <w:b/>
+                <w:bCs/>
+              </w:rPr>
+              <w:t xml:space="preserve">P8</w:t>
+            </w:r>
+            <w:r>
+              <w:t xml:space="preserve"> </w:t>
+            </w:r>
+            <w:r>
+              <w:t xml:space="preserve">Capstone + portfolio</w:t>
             </w:r>
           </w:p>
         </w:tc>
       </w:tr>
     </w:tbl>
-    <w:bookmarkStart w:id="96" w:name="pricing-model"/>
+    <w:p>
+      <w:pPr>
+        <w:pStyle w:val="BodyText"/>
+      </w:pPr>
+      <w:r>
+        <w:t xml:space="preserve">Reading completes the core</w:t>
+      </w:r>
+      <w:r>
+        <w:t xml:space="preserve"> </w:t>
+      </w:r>
+      <w:r>
+        <w:rPr>
+          <w:i/>
+          <w:iCs/>
+        </w:rPr>
+        <w:t xml:space="preserve">2084</w:t>
+      </w:r>
+      <w:r>
+        <w:t xml:space="preserve"> </w:t>
+      </w:r>
+      <w:r>
+        <w:t xml:space="preserve">arc by ~week 7; weeks 8–12 are build sprints with the ethics lens carried into every code review. The fabrication track (soldering / 3D-print / CNC) runs in parallel so several of the 8 products are physical-AI devices, not just software.</w:t>
+      </w:r>
+    </w:p>
+    <w:p>
+      <w:pPr>
+        <w:pStyle w:val="BodyText"/>
+      </w:pPr>
+      <w:r>
+        <w:t xml:space="preserve">Island Dev Crew Consulting · jon-isaac@islanddevcrew.com</w:t>
+      </w:r>
+      <w:r>
+        <w:t xml:space="preserve">Oakwood AI Lab Proposal · Page 9 of 13</w:t>
+      </w:r>
+    </w:p>
+    <w:bookmarkEnd w:id="84"/>
+    <w:bookmarkStart w:id="88" w:name="X6e4f3068ab355d6c36992c35aff46bc3685da73"/>
+    <w:p>
+      <w:pPr>
+        <w:pStyle w:val="Heading2"/>
+      </w:pPr>
+      <w:r>
+        <w:t xml:space="preserve">13 · Curriculum — Per-Student Toolchain, Pricing &amp; Outcomes</w:t>
+      </w:r>
+    </w:p>
+    <w:bookmarkStart w:id="85" w:name="X01276ab475efd305093b115bd3c4d96cf7013bf"/>
     <w:p>
       <w:pPr>
         <w:pStyle w:val="Heading3"/>
       </w:pPr>
       <w:r>
-        <w:t xml:space="preserve">Pricing model</w:t>
+        <w:t xml:space="preserve">Per-student digital toolchain (~$200–$250 / semester)</w:t>
+      </w:r>
+    </w:p>
+    <w:tbl>
+      <w:tblPr>
+        <w:tblStyle w:val="Table"/>
+        <w:tblW w:type="auto" w:w="0"/>
+        <w:tblLook w:firstRow="1" w:lastRow="0" w:firstColumn="0" w:lastColumn="0" w:noHBand="0" w:noVBand="0" w:val="0020"/>
+      </w:tblPr>
+      <w:tblGrid>
+        <w:gridCol w:w="2640"/>
+        <w:gridCol w:w="2640"/>
+        <w:gridCol w:w="2640"/>
+      </w:tblGrid>
+      <w:tr>
+        <w:trPr>
+          <w:tblHeader w:val="on"/>
+        </w:trPr>
+        <w:tc>
+          <w:tcPr/>
+          <w:p>
+            <w:pPr>
+              <w:pStyle w:val="Compact"/>
+            </w:pPr>
+            <w:r>
+              <w:t xml:space="preserve">Tool</w:t>
+            </w:r>
+          </w:p>
+        </w:tc>
+        <w:tc>
+          <w:tcPr/>
+          <w:p>
+            <w:pPr>
+              <w:pStyle w:val="Compact"/>
+            </w:pPr>
+            <w:r>
+              <w:t xml:space="preserve">/ mo</w:t>
+            </w:r>
+          </w:p>
+        </w:tc>
+        <w:tc>
+          <w:tcPr/>
+          <w:p>
+            <w:pPr>
+              <w:pStyle w:val="Compact"/>
+            </w:pPr>
+            <w:r>
+              <w:t xml:space="preserve">What it unlocks</w:t>
+            </w:r>
+          </w:p>
+        </w:tc>
+      </w:tr>
+      <w:tr>
+        <w:tc>
+          <w:tcPr/>
+          <w:p>
+            <w:pPr>
+              <w:pStyle w:val="Compact"/>
+            </w:pPr>
+            <w:r>
+              <w:t xml:space="preserve">ChatGPT Plus</w:t>
+            </w:r>
+          </w:p>
+        </w:tc>
+        <w:tc>
+          <w:tcPr/>
+          <w:p>
+            <w:pPr>
+              <w:pStyle w:val="Compact"/>
+            </w:pPr>
+            <w:r>
+              <w:t xml:space="preserve">$20</w:t>
+            </w:r>
+          </w:p>
+        </w:tc>
+        <w:tc>
+          <w:tcPr/>
+          <w:p>
+            <w:pPr>
+              <w:pStyle w:val="Compact"/>
+            </w:pPr>
+            <w:r>
+              <w:t xml:space="preserve">OpenAI frontier models</w:t>
+            </w:r>
+          </w:p>
+        </w:tc>
+      </w:tr>
+      <w:tr>
+        <w:tc>
+          <w:tcPr/>
+          <w:p>
+            <w:pPr>
+              <w:pStyle w:val="Compact"/>
+            </w:pPr>
+            <w:r>
+              <w:t xml:space="preserve">Claude Pro</w:t>
+            </w:r>
+          </w:p>
+        </w:tc>
+        <w:tc>
+          <w:tcPr/>
+          <w:p>
+            <w:pPr>
+              <w:pStyle w:val="Compact"/>
+            </w:pPr>
+            <w:r>
+              <w:t xml:space="preserve">$20</w:t>
+            </w:r>
+          </w:p>
+        </w:tc>
+        <w:tc>
+          <w:tcPr/>
+          <w:p>
+            <w:pPr>
+              <w:pStyle w:val="Compact"/>
+            </w:pPr>
+            <w:r>
+              <w:t xml:space="preserve">Anthropic frontier models</w:t>
+            </w:r>
+          </w:p>
+        </w:tc>
+      </w:tr>
+      <w:tr>
+        <w:tc>
+          <w:tcPr/>
+          <w:p>
+            <w:pPr>
+              <w:pStyle w:val="Compact"/>
+            </w:pPr>
+            <w:r>
+              <w:t xml:space="preserve">Google Gemini</w:t>
+            </w:r>
+          </w:p>
+        </w:tc>
+        <w:tc>
+          <w:tcPr/>
+          <w:p>
+            <w:pPr>
+              <w:pStyle w:val="Compact"/>
+            </w:pPr>
+            <w:r>
+              <w:t xml:space="preserve">$20</w:t>
+            </w:r>
+          </w:p>
+        </w:tc>
+        <w:tc>
+          <w:tcPr/>
+          <w:p>
+            <w:pPr>
+              <w:pStyle w:val="Compact"/>
+            </w:pPr>
+            <w:r>
+              <w:t xml:space="preserve">Google frontier models</w:t>
+            </w:r>
+          </w:p>
+        </w:tc>
+      </w:tr>
+      <w:tr>
+        <w:tc>
+          <w:tcPr/>
+          <w:p>
+            <w:pPr>
+              <w:pStyle w:val="Compact"/>
+            </w:pPr>
+            <w:r>
+              <w:t xml:space="preserve">xAI Grok</w:t>
+            </w:r>
+          </w:p>
+        </w:tc>
+        <w:tc>
+          <w:tcPr/>
+          <w:p>
+            <w:pPr>
+              <w:pStyle w:val="Compact"/>
+            </w:pPr>
+            <w:r>
+              <w:t xml:space="preserve">$20</w:t>
+            </w:r>
+          </w:p>
+        </w:tc>
+        <w:tc>
+          <w:tcPr/>
+          <w:p>
+            <w:pPr>
+              <w:pStyle w:val="Compact"/>
+            </w:pPr>
+            <w:r>
+              <w:t xml:space="preserve">xAI frontier models</w:t>
+            </w:r>
+          </w:p>
+        </w:tc>
+      </w:tr>
+      <w:tr>
+        <w:tc>
+          <w:tcPr/>
+          <w:p>
+            <w:pPr>
+              <w:pStyle w:val="Compact"/>
+            </w:pPr>
+            <w:r>
+              <w:t xml:space="preserve">OpenRouter credit</w:t>
+            </w:r>
+          </w:p>
+        </w:tc>
+        <w:tc>
+          <w:tcPr/>
+          <w:p>
+            <w:pPr>
+              <w:pStyle w:val="Compact"/>
+            </w:pPr>
+            <w:r>
+              <w:t xml:space="preserve">$20</w:t>
+            </w:r>
+          </w:p>
+        </w:tc>
+        <w:tc>
+          <w:tcPr/>
+          <w:p>
+            <w:pPr>
+              <w:pStyle w:val="Compact"/>
+            </w:pPr>
+            <w:r>
+              <w:t xml:space="preserve">One API → local, Chinese &amp; all frontier models</w:t>
+            </w:r>
+          </w:p>
+        </w:tc>
+      </w:tr>
+      <w:tr>
+        <w:tc>
+          <w:tcPr/>
+          <w:p>
+            <w:pPr>
+              <w:pStyle w:val="Compact"/>
+            </w:pPr>
+            <w:r>
+              <w:t xml:space="preserve">Vercel</w:t>
+            </w:r>
+          </w:p>
+        </w:tc>
+        <w:tc>
+          <w:tcPr/>
+          <w:p>
+            <w:pPr>
+              <w:pStyle w:val="Compact"/>
+            </w:pPr>
+            <w:r>
+              <w:t xml:space="preserve">~$0–20</w:t>
+            </w:r>
+          </w:p>
+        </w:tc>
+        <w:tc>
+          <w:tcPr/>
+          <w:p>
+            <w:pPr>
+              <w:pStyle w:val="Compact"/>
+            </w:pPr>
+            <w:r>
+              <w:t xml:space="preserve">Ship/host student apps</w:t>
+            </w:r>
+          </w:p>
+        </w:tc>
+      </w:tr>
+      <w:tr>
+        <w:tc>
+          <w:tcPr/>
+          <w:p>
+            <w:pPr>
+              <w:pStyle w:val="Compact"/>
+            </w:pPr>
+            <w:r>
+              <w:t xml:space="preserve">Supabase</w:t>
+            </w:r>
+          </w:p>
+        </w:tc>
+        <w:tc>
+          <w:tcPr/>
+          <w:p>
+            <w:pPr>
+              <w:pStyle w:val="Compact"/>
+            </w:pPr>
+            <w:r>
+              <w:t xml:space="preserve">~$0–25</w:t>
+            </w:r>
+          </w:p>
+        </w:tc>
+        <w:tc>
+          <w:tcPr/>
+          <w:p>
+            <w:pPr>
+              <w:pStyle w:val="Compact"/>
+            </w:pPr>
+            <w:r>
+              <w:t xml:space="preserve">Auth + database backend</w:t>
+            </w:r>
+          </w:p>
+        </w:tc>
+      </w:tr>
+      <w:tr>
+        <w:tc>
+          <w:tcPr>
+            <w:gridSpan w:val="2"/>
+          </w:tcPr>
+          <w:p>
+            <w:pPr>
+              <w:pStyle w:val="Compact"/>
+            </w:pPr>
+            <w:r>
+              <w:t xml:space="preserve">≈ $100/mo subscriptions + hosting</w:t>
+            </w:r>
+          </w:p>
+        </w:tc>
+        <w:tc>
+          <w:tcPr/>
+          <w:p>
+            <w:pPr>
+              <w:pStyle w:val="Compact"/>
+            </w:pPr>
+            <w:r>
+              <w:t xml:space="preserve">=</w:t>
+            </w:r>
+            <w:r>
+              <w:t xml:space="preserve"> </w:t>
+            </w:r>
+            <w:r>
+              <w:rPr>
+                <w:b/>
+                <w:bCs/>
+              </w:rPr>
+              <w:t xml:space="preserve">$200–$250 / student</w:t>
+            </w:r>
+            <w:r>
+              <w:t xml:space="preserve"> </w:t>
+            </w:r>
+            <w:r>
+              <w:t xml:space="preserve">for the semester</w:t>
+            </w:r>
+          </w:p>
+        </w:tc>
+      </w:tr>
+    </w:tbl>
+    <w:p>
+      <w:pPr>
+        <w:pStyle w:val="BodyText"/>
+      </w:pPr>
+      <w:r>
+        <w:t xml:space="preserve">This gives every student the</w:t>
+      </w:r>
+      <w:r>
+        <w:t xml:space="preserve"> </w:t>
+      </w:r>
+      <w:r>
+        <w:rPr>
+          <w:b/>
+          <w:bCs/>
+        </w:rPr>
+        <w:t xml:space="preserve">top four frontier labs + local &amp; open models</w:t>
+      </w:r>
+      <w:r>
+        <w:t xml:space="preserve"> </w:t>
+      </w:r>
+      <w:r>
+        <w:t xml:space="preserve">via one toolchain — enough to design, build, deploy, and host real products.</w:t>
+      </w:r>
+    </w:p>
+    <w:bookmarkEnd w:id="85"/>
+    <w:bookmarkStart w:id="86" w:name="all-in-student-price-the-outcome"/>
+    <w:p>
+      <w:pPr>
+        <w:pStyle w:val="Heading3"/>
+      </w:pPr>
+      <w:r>
+        <w:t xml:space="preserve">All-in student price &amp; the outcome</w:t>
       </w:r>
     </w:p>
     <w:p>
@@ -5590,75 +6132,45 @@
           <w:b/>
           <w:bCs/>
         </w:rPr>
-        <w:t xml:space="preserve">All-in student price — $300–$350 / student:</w:t>
-      </w:r>
-      <w:r>
-        <w:t xml:space="preserve"> </w:t>
-      </w:r>
-      <w:r>
-        <w:t xml:space="preserve">a single combined price covering the</w:t>
-      </w:r>
-      <w:r>
-        <w:t xml:space="preserve"> </w:t>
-      </w:r>
-      <w:r>
-        <w:rPr>
-          <w:b/>
-          <w:bCs/>
-        </w:rPr>
-        <w:t xml:space="preserve">digital pass</w:t>
-      </w:r>
-      <w:r>
-        <w:t xml:space="preserve"> </w:t>
-      </w:r>
-      <w:r>
-        <w:t xml:space="preserve">(lab access, local-AI toolchain, project templates, eval harness, demo-board publishing, portfolio site)</w:t>
-      </w:r>
-      <w:r>
-        <w:t xml:space="preserve"> </w:t>
-      </w:r>
-      <w:r>
-        <w:rPr>
-          <w:b/>
-          <w:bCs/>
-        </w:rPr>
-        <w:t xml:space="preserve">and all course materials, including the</w:t>
-      </w:r>
-      <w:r>
-        <w:rPr>
-          <w:b/>
-          <w:bCs/>
-        </w:rPr>
-        <w:t xml:space="preserve"> </w:t>
-      </w:r>
-      <w:r>
-        <w:rPr>
-          <w:b/>
-          <w:bCs/>
+        <w:t xml:space="preserve">All-in: $300–$350 / student</w:t>
+      </w:r>
+      <w:r>
+        <w:t xml:space="preserve"> </w:t>
+      </w:r>
+      <w:r>
+        <w:t xml:space="preserve">— the</w:t>
+      </w:r>
+      <w:r>
+        <w:t xml:space="preserve"> </w:t>
+      </w:r>
+      <w:r>
+        <w:rPr>
+          <w:b/>
+          <w:bCs/>
+        </w:rPr>
+        <w:t xml:space="preserve">$200–$250 digital toolchain</w:t>
+      </w:r>
+      <w:r>
+        <w:t xml:space="preserve"> </w:t>
+      </w:r>
+      <w:r>
+        <w:t xml:space="preserve">+ course materials + the</w:t>
+      </w:r>
+      <w:r>
+        <w:t xml:space="preserve"> </w:t>
+      </w:r>
+      <w:r>
+        <w:rPr>
           <w:i/>
           <w:iCs/>
         </w:rPr>
         <w:t xml:space="preserve">2084</w:t>
       </w:r>
       <w:r>
-        <w:rPr>
-          <w:b/>
-          <w:bCs/>
-        </w:rPr>
-        <w:t xml:space="preserve"> </w:t>
-      </w:r>
-      <w:r>
-        <w:rPr>
-          <w:b/>
-          <w:bCs/>
-        </w:rPr>
-        <w:t xml:space="preserve">textbook</w:t>
-      </w:r>
-      <w:r>
-        <w:t xml:space="preserve"> </w:t>
-      </w:r>
-      <w:r>
-        <w:t xml:space="preserve">— no separate book charge.</w:t>
+        <w:t xml:space="preserve"> </w:t>
+      </w:r>
+      <w:r>
+        <w:t xml:space="preserve">book (combined; no separate book charge).</w:t>
       </w:r>
     </w:p>
     <w:p>
@@ -5670,73 +6182,52 @@
         </w:numPr>
       </w:pPr>
       <w:r>
-        <w:t xml:space="preserve">Two new courses:</w:t>
-      </w:r>
-      <w:r>
-        <w:t xml:space="preserve"> </w:t>
-      </w:r>
-      <w:r>
-        <w:rPr>
-          <w:b/>
-          <w:bCs/>
-        </w:rPr>
-        <w:t xml:space="preserve">AI Engineering</w:t>
-      </w:r>
-      <w:r>
-        <w:t xml:space="preserve"> </w:t>
-      </w:r>
-      <w:r>
-        <w:t xml:space="preserve">+</w:t>
-      </w:r>
-      <w:r>
-        <w:t xml:space="preserve"> </w:t>
-      </w:r>
-      <w:r>
-        <w:rPr>
-          <w:b/>
-          <w:bCs/>
-        </w:rPr>
-        <w:t xml:space="preserve">hands-on Machining/CNC</w:t>
-      </w:r>
-      <w:r>
-        <w:t xml:space="preserve"> </w:t>
-      </w:r>
-      <w:r>
-        <w:t xml:space="preserve">— reduces required external co-op hours.</w:t>
-      </w:r>
-    </w:p>
-    <w:bookmarkEnd w:id="96"/>
-    <w:bookmarkStart w:id="97" w:name="why-it-lands-at-oakwood"/>
-    <w:p>
-      <w:pPr>
-        <w:pStyle w:val="Heading3"/>
-      </w:pPr>
-      <w:r>
-        <w:t xml:space="preserve">Why it lands at Oakwood</w:t>
-      </w:r>
-    </w:p>
-    <w:p>
-      <w:pPr>
-        <w:pStyle w:val="FirstParagraph"/>
-      </w:pPr>
-      <w:r>
-        <w:t xml:space="preserve">As the only SDA HBCU, Oakwood can teach AI with a</w:t>
-      </w:r>
-      <w:r>
-        <w:t xml:space="preserve"> </w:t>
-      </w:r>
-      <w:r>
-        <w:rPr>
-          <w:b/>
-          <w:bCs/>
-        </w:rPr>
-        <w:t xml:space="preserve">worldview-grounded ethics voice</w:t>
-      </w:r>
-      <w:r>
-        <w:t xml:space="preserve"> </w:t>
-      </w:r>
-      <w:r>
-        <w:t xml:space="preserve">secular schools struggle to articulate — data dignity, human-in-the-loop, Sabbath as a model for digital rest. Graduates leave with a portfolio</w:t>
+        <w:rPr>
+          <w:b/>
+          <w:bCs/>
+        </w:rPr>
+        <w:t xml:space="preserve">The deliverable:</w:t>
+      </w:r>
+      <w:r>
+        <w:t xml:space="preserve"> </w:t>
+      </w:r>
+      <w:r>
+        <w:t xml:space="preserve">by the time they leave the class — and certainly by graduation —</w:t>
+      </w:r>
+      <w:r>
+        <w:t xml:space="preserve"> </w:t>
+      </w:r>
+      <w:r>
+        <w:rPr>
+          <w:b/>
+          <w:bCs/>
+        </w:rPr>
+        <w:t xml:space="preserve">each student has 8 fully functioning products to their name</w:t>
+      </w:r>
+      <w:r>
+        <w:t xml:space="preserve">: an app, a business, software, a physical-AI device, or a publication.</w:t>
+      </w:r>
+    </w:p>
+    <w:p>
+      <w:pPr>
+        <w:pStyle w:val="Compact"/>
+        <w:numPr>
+          <w:ilvl w:val="0"/>
+          <w:numId w:val="1003"/>
+        </w:numPr>
+      </w:pPr>
+      <w:r>
+        <w:rPr>
+          <w:b/>
+          <w:bCs/>
+        </w:rPr>
+        <w:t xml:space="preserve">The promise:</w:t>
+      </w:r>
+      <w:r>
+        <w:t xml:space="preserve"> </w:t>
+      </w:r>
+      <w:r>
+        <w:t xml:space="preserve">students graduate</w:t>
       </w:r>
       <w:r>
         <w:t xml:space="preserve"> </w:t>
@@ -5746,6 +6237,56 @@
           <w:i/>
           <w:iCs/>
         </w:rPr>
+        <w:t xml:space="preserve">job-ready and able to ship</w:t>
+      </w:r>
+      <w:r>
+        <w:t xml:space="preserve"> </w:t>
+      </w:r>
+      <w:r>
+        <w:t xml:space="preserve">— a sharpened, market-relevant portfolio instead of just a résumé.</w:t>
+      </w:r>
+    </w:p>
+    <w:bookmarkEnd w:id="86"/>
+    <w:bookmarkStart w:id="87" w:name="why-it-lands-at-oakwood"/>
+    <w:p>
+      <w:pPr>
+        <w:pStyle w:val="Heading3"/>
+      </w:pPr>
+      <w:r>
+        <w:t xml:space="preserve">Why it lands at Oakwood</w:t>
+      </w:r>
+    </w:p>
+    <w:p>
+      <w:pPr>
+        <w:pStyle w:val="FirstParagraph"/>
+      </w:pPr>
+      <w:r>
+        <w:t xml:space="preserve">As the only SDA HBCU, Oakwood can teach AI with a</w:t>
+      </w:r>
+      <w:r>
+        <w:t xml:space="preserve"> </w:t>
+      </w:r>
+      <w:r>
+        <w:rPr>
+          <w:b/>
+          <w:bCs/>
+        </w:rPr>
+        <w:t xml:space="preserve">worldview-grounded ethics voice</w:t>
+      </w:r>
+      <w:r>
+        <w:t xml:space="preserve"> </w:t>
+      </w:r>
+      <w:r>
+        <w:t xml:space="preserve">secular schools struggle to articulate — data dignity, human-in-the-loop, Sabbath as a model for digital rest. Graduates leave with a portfolio</w:t>
+      </w:r>
+      <w:r>
+        <w:t xml:space="preserve"> </w:t>
+      </w:r>
+      <w:r>
+        <w:rPr>
+          <w:i/>
+          <w:iCs/>
+        </w:rPr>
         <w:t xml:space="preserve">and</w:t>
       </w:r>
       <w:r>
@@ -5755,7 +6296,7 @@
         <w:t xml:space="preserve">a point of view.</w:t>
       </w:r>
     </w:p>
-    <w:bookmarkEnd w:id="97"/>
+    <w:bookmarkEnd w:id="87"/>
     <w:p>
       <w:pPr>
         <w:pStyle w:val="BodyText"/>
@@ -5764,20 +6305,20 @@
         <w:t xml:space="preserve">Island Dev Crew Consulting · jon-isaac@islanddevcrew.com</w:t>
       </w:r>
       <w:r>
-        <w:t xml:space="preserve">Oakwood AI Lab Proposal · Page 9 of 12</w:t>
-      </w:r>
-    </w:p>
-    <w:bookmarkEnd w:id="98"/>
-    <w:bookmarkStart w:id="101" w:name="X9ebed9d50600541dbf8d58b8f0d09140ffff87c"/>
+        <w:t xml:space="preserve">Oakwood AI Lab Proposal · Page 10 of 13</w:t>
+      </w:r>
+    </w:p>
+    <w:bookmarkEnd w:id="88"/>
+    <w:bookmarkStart w:id="91" w:name="X9ebed9d50600541dbf8d58b8f0d09140ffff87c"/>
     <w:p>
       <w:pPr>
         <w:pStyle w:val="Heading2"/>
       </w:pPr>
       <w:r>
-        <w:t xml:space="preserve">13 · Fundraising, Match Funds &amp; the Naming Opportunity</w:t>
-      </w:r>
-    </w:p>
-    <w:bookmarkStart w:id="99" w:name="grant-corporate-funding"/>
+        <w:t xml:space="preserve">14 · Fundraising, Match Funds &amp; the Naming Opportunity</w:t>
+      </w:r>
+    </w:p>
+    <w:bookmarkStart w:id="89" w:name="grant-corporate-funding"/>
     <w:p>
       <w:pPr>
         <w:pStyle w:val="Heading3"/>
@@ -5874,8 +6415,8 @@
         <w:t xml:space="preserve">programs.</w:t>
       </w:r>
     </w:p>
-    <w:bookmarkEnd w:id="99"/>
-    <w:bookmarkStart w:id="100" w:name="notoriety-the-naming-track"/>
+    <w:bookmarkEnd w:id="89"/>
+    <w:bookmarkStart w:id="90" w:name="notoriety-the-naming-track"/>
     <w:p>
       <w:pPr>
         <w:pStyle w:val="Heading3"/>
@@ -5976,15 +6517,15 @@
         <w:t xml:space="preserve">curriculum with a named-gift envelope that funds the grant-ineligible facility scope.</w:t>
       </w:r>
     </w:p>
-    <w:bookmarkEnd w:id="100"/>
-    <w:bookmarkEnd w:id="101"/>
-    <w:bookmarkStart w:id="102" w:name="Xce6817c06586cd0c1204ec793e577c5bc6345f4"/>
+    <w:bookmarkEnd w:id="90"/>
+    <w:bookmarkEnd w:id="91"/>
+    <w:bookmarkStart w:id="92" w:name="Xce6817c06586cd0c1204ec793e577c5bc6345f4"/>
     <w:p>
       <w:pPr>
         <w:pStyle w:val="Heading2"/>
       </w:pPr>
       <w:r>
-        <w:t xml:space="preserve">14 · Department-Wide Vision</w:t>
+        <w:t xml:space="preserve">15 · Department-Wide Vision</w:t>
       </w:r>
       <w:r>
         <w:t xml:space="preserve"> </w:t>
@@ -6273,17 +6814,17 @@
         <w:t xml:space="preserve">Island Dev Crew Consulting · jon-isaac@islanddevcrew.com</w:t>
       </w:r>
       <w:r>
-        <w:t xml:space="preserve">Oakwood AI Lab Proposal · Page 10 of 12</w:t>
-      </w:r>
-    </w:p>
-    <w:bookmarkEnd w:id="102"/>
-    <w:bookmarkStart w:id="136" w:name="primary-source-links-references"/>
+        <w:t xml:space="preserve">Oakwood AI Lab Proposal · Page 11 of 13</w:t>
+      </w:r>
+    </w:p>
+    <w:bookmarkEnd w:id="92"/>
+    <w:bookmarkStart w:id="133" w:name="primary-source-links-references"/>
     <w:p>
       <w:pPr>
         <w:pStyle w:val="Heading2"/>
       </w:pPr>
       <w:r>
-        <w:t xml:space="preserve">15 · Primary Source Links &amp; References</w:t>
+        <w:t xml:space="preserve">16 · Primary Source Links &amp; References</w:t>
       </w:r>
     </w:p>
     <w:p>
@@ -6294,7 +6835,7 @@
         <w:t xml:space="preserve">Every quoted price traces to a named vendor or published benchmark (current June 2026). Re-quote each line to a sealed bid before purchase; 2026 memory-market pricing is time-sensitive.</w:t>
       </w:r>
     </w:p>
-    <w:bookmarkStart w:id="111" w:name="ai-compute"/>
+    <w:bookmarkStart w:id="101" w:name="ai-compute"/>
     <w:p>
       <w:pPr>
         <w:pStyle w:val="Heading3"/>
@@ -6311,7 +6852,7 @@
           <w:numId w:val="1006"/>
         </w:numPr>
       </w:pPr>
-      <w:hyperlink r:id="rId103">
+      <w:hyperlink r:id="rId93">
         <w:r>
           <w:rPr>
             <w:rStyle w:val="Hyperlink"/>
@@ -6328,7 +6869,7 @@
           <w:numId w:val="1006"/>
         </w:numPr>
       </w:pPr>
-      <w:hyperlink r:id="rId104">
+      <w:hyperlink r:id="rId94">
         <w:r>
           <w:rPr>
             <w:rStyle w:val="Hyperlink"/>
@@ -6345,7 +6886,7 @@
           <w:numId w:val="1006"/>
         </w:numPr>
       </w:pPr>
-      <w:hyperlink r:id="rId105">
+      <w:hyperlink r:id="rId95">
         <w:r>
           <w:rPr>
             <w:rStyle w:val="Hyperlink"/>
@@ -6362,7 +6903,7 @@
           <w:numId w:val="1006"/>
         </w:numPr>
       </w:pPr>
-      <w:hyperlink r:id="rId106">
+      <w:hyperlink r:id="rId96">
         <w:r>
           <w:rPr>
             <w:rStyle w:val="Hyperlink"/>
@@ -6379,7 +6920,7 @@
           <w:numId w:val="1006"/>
         </w:numPr>
       </w:pPr>
-      <w:hyperlink r:id="rId107">
+      <w:hyperlink r:id="rId97">
         <w:r>
           <w:rPr>
             <w:rStyle w:val="Hyperlink"/>
@@ -6396,7 +6937,7 @@
           <w:numId w:val="1006"/>
         </w:numPr>
       </w:pPr>
-      <w:hyperlink r:id="rId108">
+      <w:hyperlink r:id="rId98">
         <w:r>
           <w:rPr>
             <w:rStyle w:val="Hyperlink"/>
@@ -6413,7 +6954,7 @@
           <w:numId w:val="1006"/>
         </w:numPr>
       </w:pPr>
-      <w:hyperlink r:id="rId109">
+      <w:hyperlink r:id="rId99">
         <w:r>
           <w:rPr>
             <w:rStyle w:val="Hyperlink"/>
@@ -6430,7 +6971,7 @@
           <w:numId w:val="1006"/>
         </w:numPr>
       </w:pPr>
-      <w:hyperlink r:id="rId110">
+      <w:hyperlink r:id="rId100">
         <w:r>
           <w:rPr>
             <w:rStyle w:val="Hyperlink"/>
@@ -6439,8 +6980,8 @@
         </w:r>
       </w:hyperlink>
     </w:p>
-    <w:bookmarkEnd w:id="111"/>
-    <w:bookmarkStart w:id="120" w:name="engineering-fabrication"/>
+    <w:bookmarkEnd w:id="101"/>
+    <w:bookmarkStart w:id="110" w:name="engineering-fabrication"/>
     <w:p>
       <w:pPr>
         <w:pStyle w:val="Heading3"/>
@@ -6457,7 +6998,7 @@
           <w:numId w:val="1007"/>
         </w:numPr>
       </w:pPr>
-      <w:hyperlink r:id="rId112">
+      <w:hyperlink r:id="rId102">
         <w:r>
           <w:rPr>
             <w:rStyle w:val="Hyperlink"/>
@@ -6474,7 +7015,7 @@
           <w:numId w:val="1007"/>
         </w:numPr>
       </w:pPr>
-      <w:hyperlink r:id="rId113">
+      <w:hyperlink r:id="rId103">
         <w:r>
           <w:rPr>
             <w:rStyle w:val="Hyperlink"/>
@@ -6491,7 +7032,7 @@
           <w:numId w:val="1007"/>
         </w:numPr>
       </w:pPr>
-      <w:hyperlink r:id="rId114">
+      <w:hyperlink r:id="rId104">
         <w:r>
           <w:rPr>
             <w:rStyle w:val="Hyperlink"/>
@@ -6508,7 +7049,7 @@
           <w:numId w:val="1007"/>
         </w:numPr>
       </w:pPr>
-      <w:hyperlink r:id="rId115">
+      <w:hyperlink r:id="rId105">
         <w:r>
           <w:rPr>
             <w:rStyle w:val="Hyperlink"/>
@@ -6525,7 +7066,7 @@
           <w:numId w:val="1007"/>
         </w:numPr>
       </w:pPr>
-      <w:hyperlink r:id="rId116">
+      <w:hyperlink r:id="rId106">
         <w:r>
           <w:rPr>
             <w:rStyle w:val="Hyperlink"/>
@@ -6542,7 +7083,7 @@
           <w:numId w:val="1007"/>
         </w:numPr>
       </w:pPr>
-      <w:hyperlink r:id="rId117">
+      <w:hyperlink r:id="rId107">
         <w:r>
           <w:rPr>
             <w:rStyle w:val="Hyperlink"/>
@@ -6559,7 +7100,7 @@
           <w:numId w:val="1007"/>
         </w:numPr>
       </w:pPr>
-      <w:hyperlink r:id="rId118">
+      <w:hyperlink r:id="rId108">
         <w:r>
           <w:rPr>
             <w:rStyle w:val="Hyperlink"/>
@@ -6576,7 +7117,7 @@
           <w:numId w:val="1007"/>
         </w:numPr>
       </w:pPr>
-      <w:hyperlink r:id="rId119">
+      <w:hyperlink r:id="rId109">
         <w:r>
           <w:rPr>
             <w:rStyle w:val="Hyperlink"/>
@@ -6585,8 +7126,8 @@
         </w:r>
       </w:hyperlink>
     </w:p>
-    <w:bookmarkEnd w:id="120"/>
-    <w:bookmarkStart w:id="128" w:name="network-security"/>
+    <w:bookmarkEnd w:id="110"/>
+    <w:bookmarkStart w:id="118" w:name="network-security"/>
     <w:p>
       <w:pPr>
         <w:pStyle w:val="Heading3"/>
@@ -6603,7 +7144,7 @@
           <w:numId w:val="1008"/>
         </w:numPr>
       </w:pPr>
-      <w:hyperlink r:id="rId121">
+      <w:hyperlink r:id="rId111">
         <w:r>
           <w:rPr>
             <w:rStyle w:val="Hyperlink"/>
@@ -6620,7 +7161,7 @@
           <w:numId w:val="1008"/>
         </w:numPr>
       </w:pPr>
-      <w:hyperlink r:id="rId122">
+      <w:hyperlink r:id="rId112">
         <w:r>
           <w:rPr>
             <w:rStyle w:val="Hyperlink"/>
@@ -6637,7 +7178,7 @@
           <w:numId w:val="1008"/>
         </w:numPr>
       </w:pPr>
-      <w:hyperlink r:id="rId123">
+      <w:hyperlink r:id="rId113">
         <w:r>
           <w:rPr>
             <w:rStyle w:val="Hyperlink"/>
@@ -6654,7 +7195,7 @@
           <w:numId w:val="1008"/>
         </w:numPr>
       </w:pPr>
-      <w:hyperlink r:id="rId124">
+      <w:hyperlink r:id="rId114">
         <w:r>
           <w:rPr>
             <w:rStyle w:val="Hyperlink"/>
@@ -6671,7 +7212,7 @@
           <w:numId w:val="1008"/>
         </w:numPr>
       </w:pPr>
-      <w:hyperlink r:id="rId125">
+      <w:hyperlink r:id="rId115">
         <w:r>
           <w:rPr>
             <w:rStyle w:val="Hyperlink"/>
@@ -6688,7 +7229,7 @@
           <w:numId w:val="1008"/>
         </w:numPr>
       </w:pPr>
-      <w:hyperlink r:id="rId126">
+      <w:hyperlink r:id="rId116">
         <w:r>
           <w:rPr>
             <w:rStyle w:val="Hyperlink"/>
@@ -6705,7 +7246,7 @@
           <w:numId w:val="1008"/>
         </w:numPr>
       </w:pPr>
-      <w:hyperlink r:id="rId127">
+      <w:hyperlink r:id="rId117">
         <w:r>
           <w:rPr>
             <w:rStyle w:val="Hyperlink"/>
@@ -6714,14 +7255,14 @@
         </w:r>
       </w:hyperlink>
     </w:p>
-    <w:bookmarkEnd w:id="128"/>
-    <w:bookmarkStart w:id="132" w:name="facility-benchmarks"/>
+    <w:bookmarkEnd w:id="118"/>
+    <w:bookmarkStart w:id="127" w:name="student-toolchain-curriculum"/>
     <w:p>
       <w:pPr>
         <w:pStyle w:val="Heading3"/>
       </w:pPr>
       <w:r>
-        <w:t xml:space="preserve">Facility benchmarks</w:t>
+        <w:t xml:space="preserve">Student toolchain / curriculum</w:t>
       </w:r>
     </w:p>
     <w:p>
@@ -6732,7 +7273,153 @@
           <w:numId w:val="1009"/>
         </w:numPr>
       </w:pPr>
-      <w:hyperlink r:id="rId129">
+      <w:hyperlink r:id="rId119">
+        <w:r>
+          <w:rPr>
+            <w:rStyle w:val="Hyperlink"/>
+          </w:rPr>
+          <w:t xml:space="preserve">ChatGPT (OpenAI)</w:t>
+        </w:r>
+      </w:hyperlink>
+    </w:p>
+    <w:p>
+      <w:pPr>
+        <w:pStyle w:val="Compact"/>
+        <w:numPr>
+          <w:ilvl w:val="0"/>
+          <w:numId w:val="1009"/>
+        </w:numPr>
+      </w:pPr>
+      <w:hyperlink r:id="rId120">
+        <w:r>
+          <w:rPr>
+            <w:rStyle w:val="Hyperlink"/>
+          </w:rPr>
+          <w:t xml:space="preserve">Claude (Anthropic)</w:t>
+        </w:r>
+      </w:hyperlink>
+    </w:p>
+    <w:p>
+      <w:pPr>
+        <w:pStyle w:val="Compact"/>
+        <w:numPr>
+          <w:ilvl w:val="0"/>
+          <w:numId w:val="1009"/>
+        </w:numPr>
+      </w:pPr>
+      <w:hyperlink r:id="rId121">
+        <w:r>
+          <w:rPr>
+            <w:rStyle w:val="Hyperlink"/>
+          </w:rPr>
+          <w:t xml:space="preserve">Google Gemini</w:t>
+        </w:r>
+      </w:hyperlink>
+    </w:p>
+    <w:p>
+      <w:pPr>
+        <w:pStyle w:val="Compact"/>
+        <w:numPr>
+          <w:ilvl w:val="0"/>
+          <w:numId w:val="1009"/>
+        </w:numPr>
+      </w:pPr>
+      <w:hyperlink r:id="rId122">
+        <w:r>
+          <w:rPr>
+            <w:rStyle w:val="Hyperlink"/>
+          </w:rPr>
+          <w:t xml:space="preserve">xAI Grok</w:t>
+        </w:r>
+      </w:hyperlink>
+    </w:p>
+    <w:p>
+      <w:pPr>
+        <w:pStyle w:val="Compact"/>
+        <w:numPr>
+          <w:ilvl w:val="0"/>
+          <w:numId w:val="1009"/>
+        </w:numPr>
+      </w:pPr>
+      <w:hyperlink r:id="rId123">
+        <w:r>
+          <w:rPr>
+            <w:rStyle w:val="Hyperlink"/>
+          </w:rPr>
+          <w:t xml:space="preserve">OpenRouter (one API, all models)</w:t>
+        </w:r>
+      </w:hyperlink>
+    </w:p>
+    <w:p>
+      <w:pPr>
+        <w:pStyle w:val="Compact"/>
+        <w:numPr>
+          <w:ilvl w:val="0"/>
+          <w:numId w:val="1009"/>
+        </w:numPr>
+      </w:pPr>
+      <w:hyperlink r:id="rId124">
+        <w:r>
+          <w:rPr>
+            <w:rStyle w:val="Hyperlink"/>
+          </w:rPr>
+          <w:t xml:space="preserve">Vercel (hosting)</w:t>
+        </w:r>
+      </w:hyperlink>
+    </w:p>
+    <w:p>
+      <w:pPr>
+        <w:pStyle w:val="Compact"/>
+        <w:numPr>
+          <w:ilvl w:val="0"/>
+          <w:numId w:val="1009"/>
+        </w:numPr>
+      </w:pPr>
+      <w:hyperlink r:id="rId125">
+        <w:r>
+          <w:rPr>
+            <w:rStyle w:val="Hyperlink"/>
+          </w:rPr>
+          <w:t xml:space="preserve">Supabase (backend/DB)</w:t>
+        </w:r>
+      </w:hyperlink>
+    </w:p>
+    <w:p>
+      <w:pPr>
+        <w:pStyle w:val="Compact"/>
+        <w:numPr>
+          <w:ilvl w:val="0"/>
+          <w:numId w:val="1009"/>
+        </w:numPr>
+      </w:pPr>
+      <w:hyperlink r:id="rId126">
+        <w:r>
+          <w:rPr>
+            <w:rStyle w:val="Hyperlink"/>
+          </w:rPr>
+          <w:t xml:space="preserve">2084 and the AI Revolution (Lennox, 2024)</w:t>
+        </w:r>
+      </w:hyperlink>
+    </w:p>
+    <w:bookmarkEnd w:id="127"/>
+    <w:bookmarkStart w:id="131" w:name="facility-benchmarks"/>
+    <w:p>
+      <w:pPr>
+        <w:pStyle w:val="Heading3"/>
+      </w:pPr>
+      <w:r>
+        <w:t xml:space="preserve">Facility benchmarks</w:t>
+      </w:r>
+    </w:p>
+    <w:p>
+      <w:pPr>
+        <w:pStyle w:val="Compact"/>
+        <w:numPr>
+          <w:ilvl w:val="0"/>
+          <w:numId w:val="1010"/>
+        </w:numPr>
+      </w:pPr>
+      <w:hyperlink r:id="rId128">
         <w:r>
           <w:rPr>
             <w:rStyle w:val="Hyperlink"/>
@@ -6746,10 +7433,10 @@
         <w:pStyle w:val="Compact"/>
         <w:numPr>
           <w:ilvl w:val="0"/>
-          <w:numId w:val="1009"/>
+          <w:numId w:val="1010"/>
         </w:numPr>
       </w:pPr>
-      <w:hyperlink r:id="rId130">
+      <w:hyperlink r:id="rId129">
         <w:r>
           <w:rPr>
             <w:rStyle w:val="Hyperlink"/>
@@ -6763,10 +7450,10 @@
         <w:pStyle w:val="Compact"/>
         <w:numPr>
           <w:ilvl w:val="0"/>
-          <w:numId w:val="1009"/>
+          <w:numId w:val="1010"/>
         </w:numPr>
       </w:pPr>
-      <w:hyperlink r:id="rId131">
+      <w:hyperlink r:id="rId130">
         <w:r>
           <w:rPr>
             <w:rStyle w:val="Hyperlink"/>
@@ -6775,35 +7462,8 @@
         </w:r>
       </w:hyperlink>
     </w:p>
-    <w:bookmarkEnd w:id="132"/>
-    <w:bookmarkStart w:id="134" w:name="curriculum"/>
-    <w:p>
-      <w:pPr>
-        <w:pStyle w:val="Heading3"/>
-      </w:pPr>
-      <w:r>
-        <w:t xml:space="preserve">Curriculum</w:t>
-      </w:r>
-    </w:p>
-    <w:p>
-      <w:pPr>
-        <w:pStyle w:val="Compact"/>
-        <w:numPr>
-          <w:ilvl w:val="0"/>
-          <w:numId w:val="1010"/>
-        </w:numPr>
-      </w:pPr>
-      <w:hyperlink r:id="rId133">
-        <w:r>
-          <w:rPr>
-            <w:rStyle w:val="Hyperlink"/>
-          </w:rPr>
-          <w:t xml:space="preserve">2084 and the AI Revolution (Lennox, 2024)</w:t>
-        </w:r>
-      </w:hyperlink>
-    </w:p>
-    <w:bookmarkEnd w:id="134"/>
-    <w:bookmarkStart w:id="135" w:name="Xe9bbc0124bf894a5ad066b6b25723bc7c6d7b99"/>
+    <w:bookmarkEnd w:id="131"/>
+    <w:bookmarkStart w:id="132" w:name="Xe9bbc0124bf894a5ad066b6b25723bc7c6d7b99"/>
     <w:p>
       <w:pPr>
         <w:pStyle w:val="Heading3"/>
@@ -6976,108 +7636,108 @@
         <w:t xml:space="preserve">Island Dev Crew Consulting · jon-isaac@islanddevcrew.com</w:t>
       </w:r>
       <w:r>
-        <w:t xml:space="preserve">Oakwood AI Lab Proposal · Page 11 of 12</w:t>
+        <w:t xml:space="preserve">Oakwood AI Lab Proposal · Page 12 of 13</w:t>
+      </w:r>
+    </w:p>
+    <w:bookmarkEnd w:id="132"/>
+    <w:bookmarkEnd w:id="133"/>
+    <w:bookmarkStart w:id="137" w:name="orchestration-reporting-next-steps"/>
+    <w:p>
+      <w:pPr>
+        <w:pStyle w:val="Heading2"/>
+      </w:pPr>
+      <w:r>
+        <w:t xml:space="preserve">17 · Orchestration, Reporting &amp; Next Steps</w:t>
+      </w:r>
+    </w:p>
+    <w:bookmarkStart w:id="134" w:name="single-point-of-accountability"/>
+    <w:p>
+      <w:pPr>
+        <w:pStyle w:val="Heading3"/>
+      </w:pPr>
+      <w:r>
+        <w:t xml:space="preserve">Single point of accountability</w:t>
+      </w:r>
+    </w:p>
+    <w:p>
+      <w:pPr>
+        <w:pStyle w:val="FirstParagraph"/>
+      </w:pPr>
+      <w:r>
+        <w:t xml:space="preserve">IDC engages and schedules every vendor &amp; Huntsville sub, manages the grant vs. facility funding lanes, and owns the timeline. One markup, one fee, one invoice.</w:t>
+      </w:r>
+    </w:p>
+    <w:bookmarkEnd w:id="134"/>
+    <w:bookmarkStart w:id="135" w:name="live-progress-reporting"/>
+    <w:p>
+      <w:pPr>
+        <w:pStyle w:val="Heading3"/>
+      </w:pPr>
+      <w:r>
+        <w:t xml:space="preserve">Live progress &amp; reporting</w:t>
+      </w:r>
+    </w:p>
+    <w:p>
+      <w:pPr>
+        <w:pStyle w:val="FirstParagraph"/>
+      </w:pPr>
+      <w:r>
+        <w:t xml:space="preserve">A live HTML</w:t>
+      </w:r>
+      <w:r>
+        <w:t xml:space="preserve"> </w:t>
+      </w:r>
+      <w:r>
+        <w:rPr>
+          <w:b/>
+          <w:bCs/>
+        </w:rPr>
+        <w:t xml:space="preserve">progress dashboard</w:t>
+      </w:r>
+      <w:r>
+        <w:t xml:space="preserve"> </w:t>
+      </w:r>
+      <w:r>
+        <w:t xml:space="preserve">link is attached to the project email;</w:t>
+      </w:r>
+      <w:r>
+        <w:t xml:space="preserve"> </w:t>
+      </w:r>
+      <w:r>
+        <w:rPr>
+          <w:b/>
+          <w:bCs/>
+        </w:rPr>
+        <w:t xml:space="preserve">weekly &amp; monthly</w:t>
+      </w:r>
+      <w:r>
+        <w:t xml:space="preserve"> </w:t>
+      </w:r>
+      <w:r>
+        <w:t xml:space="preserve">progress reports keep faculty &amp; administration abreast through commissioning.</w:t>
       </w:r>
     </w:p>
     <w:bookmarkEnd w:id="135"/>
+    <w:bookmarkStart w:id="136" w:name="protected-investment"/>
+    <w:p>
+      <w:pPr>
+        <w:pStyle w:val="Heading3"/>
+      </w:pPr>
+      <w:r>
+        <w:t xml:space="preserve">Protected investment</w:t>
+      </w:r>
+    </w:p>
+    <w:p>
+      <w:pPr>
+        <w:pStyle w:val="FirstParagraph"/>
+      </w:pPr>
+      <w:r>
+        <w:t xml:space="preserve">Department cameras + per-semester rotating access control + cabling/power done to code (incl. FPE panel replacement) mean the equipment is controlled, managed, and protected from day one.</w:t>
+      </w:r>
+    </w:p>
     <w:bookmarkEnd w:id="136"/>
-    <w:bookmarkStart w:id="140" w:name="orchestration-reporting-next-steps"/>
-    <w:p>
-      <w:pPr>
-        <w:pStyle w:val="Heading2"/>
-      </w:pPr>
-      <w:r>
-        <w:t xml:space="preserve">16 · Orchestration, Reporting &amp; Next Steps</w:t>
-      </w:r>
-    </w:p>
-    <w:bookmarkStart w:id="137" w:name="single-point-of-accountability"/>
-    <w:p>
-      <w:pPr>
-        <w:pStyle w:val="Heading3"/>
-      </w:pPr>
-      <w:r>
-        <w:t xml:space="preserve">Single point of accountability</w:t>
-      </w:r>
-    </w:p>
-    <w:p>
-      <w:pPr>
-        <w:pStyle w:val="FirstParagraph"/>
-      </w:pPr>
-      <w:r>
-        <w:t xml:space="preserve">IDC engages and schedules every vendor &amp; Huntsville sub, manages the grant vs. facility funding lanes, and owns the timeline. One markup, one fee, one invoice.</w:t>
-      </w:r>
-    </w:p>
     <w:bookmarkEnd w:id="137"/>
-    <w:bookmarkStart w:id="138" w:name="live-progress-reporting"/>
-    <w:p>
-      <w:pPr>
-        <w:pStyle w:val="Heading3"/>
-      </w:pPr>
-      <w:r>
-        <w:t xml:space="preserve">Live progress &amp; reporting</w:t>
-      </w:r>
-    </w:p>
-    <w:p>
-      <w:pPr>
-        <w:pStyle w:val="FirstParagraph"/>
-      </w:pPr>
-      <w:r>
-        <w:t xml:space="preserve">A live HTML</w:t>
-      </w:r>
-      <w:r>
-        <w:t xml:space="preserve"> </w:t>
-      </w:r>
-      <w:r>
-        <w:rPr>
-          <w:b/>
-          <w:bCs/>
-        </w:rPr>
-        <w:t xml:space="preserve">progress dashboard</w:t>
-      </w:r>
-      <w:r>
-        <w:t xml:space="preserve"> </w:t>
-      </w:r>
-      <w:r>
-        <w:t xml:space="preserve">link is attached to the project email;</w:t>
-      </w:r>
-      <w:r>
-        <w:t xml:space="preserve"> </w:t>
-      </w:r>
-      <w:r>
-        <w:rPr>
-          <w:b/>
-          <w:bCs/>
-        </w:rPr>
-        <w:t xml:space="preserve">weekly &amp; monthly</w:t>
-      </w:r>
-      <w:r>
-        <w:t xml:space="preserve"> </w:t>
-      </w:r>
-      <w:r>
-        <w:t xml:space="preserve">progress reports keep faculty &amp; administration abreast through commissioning.</w:t>
-      </w:r>
-    </w:p>
-    <w:bookmarkEnd w:id="138"/>
-    <w:bookmarkStart w:id="139" w:name="protected-investment"/>
-    <w:p>
-      <w:pPr>
-        <w:pStyle w:val="Heading3"/>
-      </w:pPr>
-      <w:r>
-        <w:t xml:space="preserve">Protected investment</w:t>
-      </w:r>
-    </w:p>
-    <w:p>
-      <w:pPr>
-        <w:pStyle w:val="FirstParagraph"/>
-      </w:pPr>
-      <w:r>
-        <w:t xml:space="preserve">Department cameras + per-semester rotating access control + cabling/power done to code (incl. FPE panel replacement) mean the equipment is controlled, managed, and protected from day one.</w:t>
-      </w:r>
-    </w:p>
-    <w:bookmarkEnd w:id="139"/>
-    <w:bookmarkEnd w:id="140"/>
-    <w:bookmarkStart w:id="143" w:name="open-items-to-confirm-before-sealed-bids"/>
+    <w:bookmarkStart w:id="140" w:name="open-items-to-confirm-before-sealed-bids"/>
     <w:p>
       <w:pPr>
         <w:pStyle w:val="Heading2"/>
@@ -7149,7 +7809,7 @@
         <w:t xml:space="preserve"> </w:t>
       </w:r>
       <w:r>
-        <w:t xml:space="preserve">Approve the Recommended Execution tier (~$172,000 all-in), release the $68,000 mobilization deposit (Stripe link, p.1 / p.11), and authorize IDC to (1) commission the licensed-electrician load study and (2) issue three sealed sub bids per trade. IDC returns firm, signed numbers within ~10 business days and begins the 90-day build.</w:t>
+        <w:t xml:space="preserve">Approve the Recommended Execution tier (~$172,000 all-in), release the $68,000 mobilization deposit (Stripe link, p.1 / p.8), and authorize IDC to (1) commission the licensed-electrician load study and (2) issue three sealed sub bids per trade. IDC returns firm, signed numbers within ~10 business days and begins the 90-day build.</w:t>
       </w:r>
     </w:p>
     <w:p>
@@ -7166,7 +7826,7 @@
       <w:r>
         <w:t xml:space="preserve"> </w:t>
       </w:r>
-      <w:hyperlink r:id="rId141">
+      <w:hyperlink r:id="rId138">
         <w:r>
           <w:rPr>
             <w:rStyle w:val="Hyperlink"/>
@@ -7200,7 +7860,7 @@
       <w:r>
         <w:t xml:space="preserve"> </w:t>
       </w:r>
-      <w:hyperlink r:id="rId142">
+      <w:hyperlink r:id="rId139">
         <w:r>
           <w:rPr>
             <w:rStyle w:val="Hyperlink"/>
@@ -7290,10 +7950,10 @@
         <w:t xml:space="preserve">Island Dev Crew Consulting · jon-isaac@islanddevcrew.com</w:t>
       </w:r>
       <w:r>
-        <w:t xml:space="preserve">Oakwood AI Lab Proposal · Page 12 of 12</w:t>
-      </w:r>
-    </w:p>
-    <w:bookmarkEnd w:id="143"/>
+        <w:t xml:space="preserve">Oakwood AI Lab Proposal · Page 13 of 13</w:t>
+      </w:r>
+    </w:p>
+    <w:bookmarkEnd w:id="140"/>
     <w:sectPr>
       <w:footnotePr>
         <w:numRestart w:val="eachSect"/>

</xml_diff>